<commit_message>
Complete sales consistency, roles, operations and course documentation
</commit_message>
<xml_diff>
--- a/docs/word/04_Cronograma.docx
+++ b/docs/word/04_Cronograma.docx
@@ -2,9 +2,6 @@
 <file path=word/document.xml><?xml version="1.0" encoding="utf-8"?>
 <w:document xmlns:wpc="http://schemas.microsoft.com/office/word/2010/wordprocessingCanvas" xmlns:mo="http://schemas.microsoft.com/office/mac/office/2008/main" xmlns:mc="http://schemas.openxmlformats.org/markup-compatibility/2006" xmlns:mv="urn:schemas-microsoft-com:mac:vml" xmlns:o="urn:schemas-microsoft-com:office:office" xmlns:r="http://schemas.openxmlformats.org/officeDocument/2006/relationships" xmlns:m="http://schemas.openxmlformats.org/officeDocument/2006/math" xmlns:v="urn:schemas-microsoft-com:vml" xmlns:wp14="http://schemas.microsoft.com/office/word/2010/wordprocessingDrawing" xmlns:wp="http://schemas.openxmlformats.org/drawingml/2006/wordprocessingDrawing" xmlns:w10="urn:schemas-microsoft-com:office:word" xmlns:w="http://schemas.openxmlformats.org/wordprocessingml/2006/main" xmlns:w14="http://schemas.microsoft.com/office/word/2010/wordml" xmlns:wpg="http://schemas.microsoft.com/office/word/2010/wordprocessingGroup" xmlns:wpi="http://schemas.microsoft.com/office/word/2010/wordprocessingInk" xmlns:wne="http://schemas.microsoft.com/office/word/2006/wordml" xmlns:wps="http://schemas.microsoft.com/office/word/2010/wordprocessingShape" mc:Ignorable="w14 wp14">
   <w:body>
-    <w:p>
-      <w:pPr/>
-    </w:p>
     <w:p>
       <w:pPr/>
     </w:p>
@@ -14,6 +11,25 @@
         <w:jc w:val="center"/>
       </w:pPr>
       <w:r>
+        <w:rPr>
+          <w:rFonts w:ascii="Arial" w:hAnsi="Arial" w:eastAsia="Arial"/>
+          <w:b/>
+          <w:color w:val="000000"/>
+          <w:sz w:val="22"/>
+        </w:rPr>
+        <w:t>BODEGA NORTE</w:t>
+      </w:r>
+    </w:p>
+    <w:p>
+      <w:pPr>
+        <w:jc w:val="center"/>
+      </w:pPr>
+      <w:r>
+        <w:rPr>
+          <w:rFonts w:ascii="Arial" w:hAnsi="Arial" w:eastAsia="Arial"/>
+          <w:color w:val="000000"/>
+          <w:sz w:val="22"/>
+        </w:rPr>
         <w:t>Cronograma de entregas y evidencias</w:t>
       </w:r>
     </w:p>
@@ -23,11 +39,12 @@
       </w:pPr>
       <w:r>
         <w:rPr>
-          <w:rFonts w:ascii="Arial" w:hAnsi="Arial"/>
-          <w:color w:val="1F4E79"/>
-          <w:sz w:val="24"/>
+          <w:rFonts w:ascii="Arial" w:hAnsi="Arial" w:eastAsia="Arial"/>
+          <w:b/>
+          <w:color w:val="000000"/>
+          <w:sz w:val="22"/>
         </w:rPr>
-        <w:t>Sistema de inventario y ventas para la bodega Bodega Norte</w:t>
+        <w:t>Experiencias Formativas en Situaciones Reales de Trabajo III (EFSR14908)</w:t>
       </w:r>
     </w:p>
     <w:p>
@@ -36,1343 +53,121 @@
       </w:pPr>
       <w:r>
         <w:rPr>
-          <w:rFonts w:ascii="Arial" w:hAnsi="Arial"/>
-          <w:b/>
-          <w:color w:val="10294B"/>
+          <w:rFonts w:ascii="Arial" w:hAnsi="Arial" w:eastAsia="Arial"/>
+          <w:color w:val="000000"/>
           <w:sz w:val="22"/>
         </w:rPr>
-        <w:t>DOCUMENTO ACADÉMICO EDITABLE</w:t>
+        <w:t>Judith Jenny Jimenez Monago</w:t>
       </w:r>
     </w:p>
-    <w:p/>
-    <w:tbl>
-      <w:tblPr>
-        <w:tblW w:type="auto" w:w="0"/>
-        <w:jc w:val="center"/>
-        <w:tblLayout w:type="autofit"/>
-        <w:tblLook w:firstColumn="1" w:firstRow="1" w:lastColumn="0" w:lastRow="0" w:noHBand="0" w:noVBand="1" w:val="04A0"/>
-      </w:tblPr>
-      <w:tblGrid>
-        <w:gridCol w:w="4320"/>
-        <w:gridCol w:w="4320"/>
-      </w:tblGrid>
-      <w:tr>
-        <w:tc>
-          <w:tcPr>
-            <w:tcW w:type="dxa" w:w="4320"/>
-            <w:shd w:fill="EAF0F6"/>
-            <w:tcBorders>
-              <w:top w:val="single" w:sz="4" w:space="0" w:color="D9D9D9"/>
-              <w:left w:val="single" w:sz="4" w:space="0" w:color="D9D9D9"/>
-              <w:bottom w:val="single" w:sz="4" w:space="0" w:color="D9D9D9"/>
-              <w:right w:val="single" w:sz="4" w:space="0" w:color="D9D9D9"/>
-              <w:insideH w:val="single" w:sz="4" w:space="0" w:color="D9D9D9"/>
-              <w:insideV w:val="single" w:sz="4" w:space="0" w:color="D9D9D9"/>
-            </w:tcBorders>
-            <w:tcMar>
-              <w:top w:w="80" w:type="dxa"/>
-              <w:start w:w="100" w:type="dxa"/>
-              <w:bottom w:w="80" w:type="dxa"/>
-              <w:end w:w="100" w:type="dxa"/>
-            </w:tcMar>
-            <w:vAlign w:val="center"/>
-          </w:tcPr>
-          <w:p>
-            <w:r>
-              <w:rPr>
-                <w:rFonts w:ascii="Arial" w:hAnsi="Arial"/>
-                <w:b/>
-                <w:color w:val="10294B"/>
-                <w:sz w:val="20"/>
-              </w:rPr>
-              <w:t>Curso</w:t>
-            </w:r>
-          </w:p>
-        </w:tc>
-        <w:tc>
-          <w:tcPr>
-            <w:tcW w:type="dxa" w:w="4320"/>
-            <w:tcBorders>
-              <w:top w:val="single" w:sz="4" w:space="0" w:color="D9D9D9"/>
-              <w:left w:val="single" w:sz="4" w:space="0" w:color="D9D9D9"/>
-              <w:bottom w:val="single" w:sz="4" w:space="0" w:color="D9D9D9"/>
-              <w:right w:val="single" w:sz="4" w:space="0" w:color="D9D9D9"/>
-              <w:insideH w:val="single" w:sz="4" w:space="0" w:color="D9D9D9"/>
-              <w:insideV w:val="single" w:sz="4" w:space="0" w:color="D9D9D9"/>
-            </w:tcBorders>
-            <w:tcMar>
-              <w:top w:w="80" w:type="dxa"/>
-              <w:start w:w="100" w:type="dxa"/>
-              <w:bottom w:w="80" w:type="dxa"/>
-              <w:end w:w="100" w:type="dxa"/>
-            </w:tcMar>
-            <w:vAlign w:val="center"/>
-          </w:tcPr>
-          <w:p>
-            <w:r>
-              <w:rPr>
-                <w:rFonts w:ascii="Arial" w:hAnsi="Arial"/>
-                <w:sz w:val="20"/>
-              </w:rPr>
-              <w:t>EFSR14908 – Experiencia Formativa en Situación Real de Trabajo</w:t>
-            </w:r>
-          </w:p>
-        </w:tc>
-      </w:tr>
-      <w:tr>
-        <w:tc>
-          <w:tcPr>
-            <w:tcW w:type="dxa" w:w="4320"/>
-            <w:shd w:fill="EAF0F6"/>
-            <w:tcBorders>
-              <w:top w:val="single" w:sz="4" w:space="0" w:color="D9D9D9"/>
-              <w:left w:val="single" w:sz="4" w:space="0" w:color="D9D9D9"/>
-              <w:bottom w:val="single" w:sz="4" w:space="0" w:color="D9D9D9"/>
-              <w:right w:val="single" w:sz="4" w:space="0" w:color="D9D9D9"/>
-              <w:insideH w:val="single" w:sz="4" w:space="0" w:color="D9D9D9"/>
-              <w:insideV w:val="single" w:sz="4" w:space="0" w:color="D9D9D9"/>
-            </w:tcBorders>
-            <w:tcMar>
-              <w:top w:w="80" w:type="dxa"/>
-              <w:start w:w="100" w:type="dxa"/>
-              <w:bottom w:w="80" w:type="dxa"/>
-              <w:end w:w="100" w:type="dxa"/>
-            </w:tcMar>
-            <w:vAlign w:val="center"/>
-          </w:tcPr>
-          <w:p>
-            <w:r>
-              <w:rPr>
-                <w:rFonts w:ascii="Arial" w:hAnsi="Arial"/>
-                <w:b/>
-                <w:color w:val="10294B"/>
-                <w:sz w:val="20"/>
-              </w:rPr>
-              <w:t>Docente</w:t>
-            </w:r>
-          </w:p>
-        </w:tc>
-        <w:tc>
-          <w:tcPr>
-            <w:tcW w:type="dxa" w:w="4320"/>
-            <w:tcBorders>
-              <w:top w:val="single" w:sz="4" w:space="0" w:color="D9D9D9"/>
-              <w:left w:val="single" w:sz="4" w:space="0" w:color="D9D9D9"/>
-              <w:bottom w:val="single" w:sz="4" w:space="0" w:color="D9D9D9"/>
-              <w:right w:val="single" w:sz="4" w:space="0" w:color="D9D9D9"/>
-              <w:insideH w:val="single" w:sz="4" w:space="0" w:color="D9D9D9"/>
-              <w:insideV w:val="single" w:sz="4" w:space="0" w:color="D9D9D9"/>
-            </w:tcBorders>
-            <w:tcMar>
-              <w:top w:w="80" w:type="dxa"/>
-              <w:start w:w="100" w:type="dxa"/>
-              <w:bottom w:w="80" w:type="dxa"/>
-              <w:end w:w="100" w:type="dxa"/>
-            </w:tcMar>
-            <w:vAlign w:val="center"/>
-          </w:tcPr>
-          <w:p>
-            <w:r>
-              <w:rPr>
-                <w:rFonts w:ascii="Arial" w:hAnsi="Arial"/>
-                <w:sz w:val="20"/>
-              </w:rPr>
-              <w:t>Judith Jiménez Monago</w:t>
-            </w:r>
-          </w:p>
-        </w:tc>
-      </w:tr>
-      <w:tr>
-        <w:tc>
-          <w:tcPr>
-            <w:tcW w:type="dxa" w:w="4320"/>
-            <w:shd w:fill="EAF0F6"/>
-            <w:tcBorders>
-              <w:top w:val="single" w:sz="4" w:space="0" w:color="D9D9D9"/>
-              <w:left w:val="single" w:sz="4" w:space="0" w:color="D9D9D9"/>
-              <w:bottom w:val="single" w:sz="4" w:space="0" w:color="D9D9D9"/>
-              <w:right w:val="single" w:sz="4" w:space="0" w:color="D9D9D9"/>
-              <w:insideH w:val="single" w:sz="4" w:space="0" w:color="D9D9D9"/>
-              <w:insideV w:val="single" w:sz="4" w:space="0" w:color="D9D9D9"/>
-            </w:tcBorders>
-            <w:tcMar>
-              <w:top w:w="80" w:type="dxa"/>
-              <w:start w:w="100" w:type="dxa"/>
-              <w:bottom w:w="80" w:type="dxa"/>
-              <w:end w:w="100" w:type="dxa"/>
-            </w:tcMar>
-            <w:vAlign w:val="center"/>
-          </w:tcPr>
-          <w:p>
-            <w:r>
-              <w:rPr>
-                <w:rFonts w:ascii="Arial" w:hAnsi="Arial"/>
-                <w:b/>
-                <w:color w:val="10294B"/>
-                <w:sz w:val="20"/>
-              </w:rPr>
-              <w:t>Periodo</w:t>
-            </w:r>
-          </w:p>
-        </w:tc>
-        <w:tc>
-          <w:tcPr>
-            <w:tcW w:type="dxa" w:w="4320"/>
-            <w:tcBorders>
-              <w:top w:val="single" w:sz="4" w:space="0" w:color="D9D9D9"/>
-              <w:left w:val="single" w:sz="4" w:space="0" w:color="D9D9D9"/>
-              <w:bottom w:val="single" w:sz="4" w:space="0" w:color="D9D9D9"/>
-              <w:right w:val="single" w:sz="4" w:space="0" w:color="D9D9D9"/>
-              <w:insideH w:val="single" w:sz="4" w:space="0" w:color="D9D9D9"/>
-              <w:insideV w:val="single" w:sz="4" w:space="0" w:color="D9D9D9"/>
-            </w:tcBorders>
-            <w:tcMar>
-              <w:top w:w="80" w:type="dxa"/>
-              <w:start w:w="100" w:type="dxa"/>
-              <w:bottom w:w="80" w:type="dxa"/>
-              <w:end w:w="100" w:type="dxa"/>
-            </w:tcMar>
-            <w:vAlign w:val="center"/>
-          </w:tcPr>
-          <w:p>
-            <w:r>
-              <w:rPr>
-                <w:rFonts w:ascii="Arial" w:hAnsi="Arial"/>
-                <w:sz w:val="20"/>
-              </w:rPr>
-              <w:t>Periodo académico 2026</w:t>
-            </w:r>
-          </w:p>
-        </w:tc>
-      </w:tr>
-      <w:tr>
-        <w:tc>
-          <w:tcPr>
-            <w:tcW w:type="dxa" w:w="4320"/>
-            <w:shd w:fill="EAF0F6"/>
-            <w:tcBorders>
-              <w:top w:val="single" w:sz="4" w:space="0" w:color="D9D9D9"/>
-              <w:left w:val="single" w:sz="4" w:space="0" w:color="D9D9D9"/>
-              <w:bottom w:val="single" w:sz="4" w:space="0" w:color="D9D9D9"/>
-              <w:right w:val="single" w:sz="4" w:space="0" w:color="D9D9D9"/>
-              <w:insideH w:val="single" w:sz="4" w:space="0" w:color="D9D9D9"/>
-              <w:insideV w:val="single" w:sz="4" w:space="0" w:color="D9D9D9"/>
-            </w:tcBorders>
-            <w:tcMar>
-              <w:top w:w="80" w:type="dxa"/>
-              <w:start w:w="100" w:type="dxa"/>
-              <w:bottom w:w="80" w:type="dxa"/>
-              <w:end w:w="100" w:type="dxa"/>
-            </w:tcMar>
-            <w:vAlign w:val="center"/>
-          </w:tcPr>
-          <w:p>
-            <w:r>
-              <w:rPr>
-                <w:rFonts w:ascii="Arial" w:hAnsi="Arial"/>
-                <w:b/>
-                <w:color w:val="10294B"/>
-                <w:sz w:val="20"/>
-              </w:rPr>
-              <w:t>Entregable</w:t>
-            </w:r>
-          </w:p>
-        </w:tc>
-        <w:tc>
-          <w:tcPr>
-            <w:tcW w:type="dxa" w:w="4320"/>
-            <w:tcBorders>
-              <w:top w:val="single" w:sz="4" w:space="0" w:color="D9D9D9"/>
-              <w:left w:val="single" w:sz="4" w:space="0" w:color="D9D9D9"/>
-              <w:bottom w:val="single" w:sz="4" w:space="0" w:color="D9D9D9"/>
-              <w:right w:val="single" w:sz="4" w:space="0" w:color="D9D9D9"/>
-              <w:insideH w:val="single" w:sz="4" w:space="0" w:color="D9D9D9"/>
-              <w:insideV w:val="single" w:sz="4" w:space="0" w:color="D9D9D9"/>
-            </w:tcBorders>
-            <w:tcMar>
-              <w:top w:w="80" w:type="dxa"/>
-              <w:start w:w="100" w:type="dxa"/>
-              <w:bottom w:w="80" w:type="dxa"/>
-              <w:end w:w="100" w:type="dxa"/>
-            </w:tcMar>
-            <w:vAlign w:val="center"/>
-          </w:tcPr>
-          <w:p>
-            <w:r>
-              <w:rPr>
-                <w:rFonts w:ascii="Arial" w:hAnsi="Arial"/>
-                <w:sz w:val="20"/>
-              </w:rPr>
-              <w:t>Documento de control del proyecto</w:t>
-            </w:r>
-          </w:p>
-        </w:tc>
-      </w:tr>
-      <w:tr>
-        <w:tc>
-          <w:tcPr>
-            <w:tcW w:type="dxa" w:w="4320"/>
-            <w:shd w:fill="EAF0F6"/>
-            <w:tcBorders>
-              <w:top w:val="single" w:sz="4" w:space="0" w:color="D9D9D9"/>
-              <w:left w:val="single" w:sz="4" w:space="0" w:color="D9D9D9"/>
-              <w:bottom w:val="single" w:sz="4" w:space="0" w:color="D9D9D9"/>
-              <w:right w:val="single" w:sz="4" w:space="0" w:color="D9D9D9"/>
-              <w:insideH w:val="single" w:sz="4" w:space="0" w:color="D9D9D9"/>
-              <w:insideV w:val="single" w:sz="4" w:space="0" w:color="D9D9D9"/>
-            </w:tcBorders>
-            <w:tcMar>
-              <w:top w:w="80" w:type="dxa"/>
-              <w:start w:w="100" w:type="dxa"/>
-              <w:bottom w:w="80" w:type="dxa"/>
-              <w:end w:w="100" w:type="dxa"/>
-            </w:tcMar>
-            <w:vAlign w:val="center"/>
-          </w:tcPr>
-          <w:p>
-            <w:r>
-              <w:rPr>
-                <w:rFonts w:ascii="Arial" w:hAnsi="Arial"/>
-                <w:b/>
-                <w:color w:val="10294B"/>
-                <w:sz w:val="20"/>
-              </w:rPr>
-              <w:t>Estudiante / integrantes</w:t>
-            </w:r>
-          </w:p>
-        </w:tc>
-        <w:tc>
-          <w:tcPr>
-            <w:tcW w:type="dxa" w:w="4320"/>
-            <w:tcBorders>
-              <w:top w:val="single" w:sz="4" w:space="0" w:color="D9D9D9"/>
-              <w:left w:val="single" w:sz="4" w:space="0" w:color="D9D9D9"/>
-              <w:bottom w:val="single" w:sz="4" w:space="0" w:color="D9D9D9"/>
-              <w:right w:val="single" w:sz="4" w:space="0" w:color="D9D9D9"/>
-              <w:insideH w:val="single" w:sz="4" w:space="0" w:color="D9D9D9"/>
-              <w:insideV w:val="single" w:sz="4" w:space="0" w:color="D9D9D9"/>
-            </w:tcBorders>
-            <w:tcMar>
-              <w:top w:w="80" w:type="dxa"/>
-              <w:start w:w="100" w:type="dxa"/>
-              <w:bottom w:w="80" w:type="dxa"/>
-              <w:end w:w="100" w:type="dxa"/>
-            </w:tcMar>
-            <w:vAlign w:val="center"/>
-          </w:tcPr>
-          <w:p>
-            <w:r>
-              <w:rPr>
-                <w:rFonts w:ascii="Arial" w:hAnsi="Arial"/>
-                <w:sz w:val="20"/>
-              </w:rPr>
-              <w:t>[Completar]</w:t>
-            </w:r>
-          </w:p>
-        </w:tc>
-      </w:tr>
-      <w:tr>
-        <w:tc>
-          <w:tcPr>
-            <w:tcW w:type="dxa" w:w="4320"/>
-            <w:shd w:fill="EAF0F6"/>
-            <w:tcBorders>
-              <w:top w:val="single" w:sz="4" w:space="0" w:color="D9D9D9"/>
-              <w:left w:val="single" w:sz="4" w:space="0" w:color="D9D9D9"/>
-              <w:bottom w:val="single" w:sz="4" w:space="0" w:color="D9D9D9"/>
-              <w:right w:val="single" w:sz="4" w:space="0" w:color="D9D9D9"/>
-              <w:insideH w:val="single" w:sz="4" w:space="0" w:color="D9D9D9"/>
-              <w:insideV w:val="single" w:sz="4" w:space="0" w:color="D9D9D9"/>
-            </w:tcBorders>
-            <w:tcMar>
-              <w:top w:w="80" w:type="dxa"/>
-              <w:start w:w="100" w:type="dxa"/>
-              <w:bottom w:w="80" w:type="dxa"/>
-              <w:end w:w="100" w:type="dxa"/>
-            </w:tcMar>
-            <w:vAlign w:val="center"/>
-          </w:tcPr>
-          <w:p>
-            <w:r>
-              <w:rPr>
-                <w:rFonts w:ascii="Arial" w:hAnsi="Arial"/>
-                <w:b/>
-                <w:color w:val="10294B"/>
-                <w:sz w:val="20"/>
-              </w:rPr>
-              <w:t>Coordinador del proyecto</w:t>
-            </w:r>
-          </w:p>
-        </w:tc>
-        <w:tc>
-          <w:tcPr>
-            <w:tcW w:type="dxa" w:w="4320"/>
-            <w:tcBorders>
-              <w:top w:val="single" w:sz="4" w:space="0" w:color="D9D9D9"/>
-              <w:left w:val="single" w:sz="4" w:space="0" w:color="D9D9D9"/>
-              <w:bottom w:val="single" w:sz="4" w:space="0" w:color="D9D9D9"/>
-              <w:right w:val="single" w:sz="4" w:space="0" w:color="D9D9D9"/>
-              <w:insideH w:val="single" w:sz="4" w:space="0" w:color="D9D9D9"/>
-              <w:insideV w:val="single" w:sz="4" w:space="0" w:color="D9D9D9"/>
-            </w:tcBorders>
-            <w:tcMar>
-              <w:top w:w="80" w:type="dxa"/>
-              <w:start w:w="100" w:type="dxa"/>
-              <w:bottom w:w="80" w:type="dxa"/>
-              <w:end w:w="100" w:type="dxa"/>
-            </w:tcMar>
-            <w:vAlign w:val="center"/>
-          </w:tcPr>
-          <w:p>
-            <w:r>
-              <w:rPr>
-                <w:rFonts w:ascii="Arial" w:hAnsi="Arial"/>
-                <w:sz w:val="20"/>
-              </w:rPr>
-              <w:t>[Completar]</w:t>
-            </w:r>
-          </w:p>
-        </w:tc>
-      </w:tr>
-      <w:tr>
-        <w:tc>
-          <w:tcPr>
-            <w:tcW w:type="dxa" w:w="4320"/>
-            <w:shd w:fill="EAF0F6"/>
-            <w:tcBorders>
-              <w:top w:val="single" w:sz="4" w:space="0" w:color="D9D9D9"/>
-              <w:left w:val="single" w:sz="4" w:space="0" w:color="D9D9D9"/>
-              <w:bottom w:val="single" w:sz="4" w:space="0" w:color="D9D9D9"/>
-              <w:right w:val="single" w:sz="4" w:space="0" w:color="D9D9D9"/>
-              <w:insideH w:val="single" w:sz="4" w:space="0" w:color="D9D9D9"/>
-              <w:insideV w:val="single" w:sz="4" w:space="0" w:color="D9D9D9"/>
-            </w:tcBorders>
-            <w:tcMar>
-              <w:top w:w="80" w:type="dxa"/>
-              <w:start w:w="100" w:type="dxa"/>
-              <w:bottom w:w="80" w:type="dxa"/>
-              <w:end w:w="100" w:type="dxa"/>
-            </w:tcMar>
-            <w:vAlign w:val="center"/>
-          </w:tcPr>
-          <w:p>
-            <w:r>
-              <w:rPr>
-                <w:rFonts w:ascii="Arial" w:hAnsi="Arial"/>
-                <w:b/>
-                <w:color w:val="10294B"/>
-                <w:sz w:val="20"/>
-              </w:rPr>
-              <w:t>Institución / bodega</w:t>
-            </w:r>
-          </w:p>
-        </w:tc>
-        <w:tc>
-          <w:tcPr>
-            <w:tcW w:type="dxa" w:w="4320"/>
-            <w:tcBorders>
-              <w:top w:val="single" w:sz="4" w:space="0" w:color="D9D9D9"/>
-              <w:left w:val="single" w:sz="4" w:space="0" w:color="D9D9D9"/>
-              <w:bottom w:val="single" w:sz="4" w:space="0" w:color="D9D9D9"/>
-              <w:right w:val="single" w:sz="4" w:space="0" w:color="D9D9D9"/>
-              <w:insideH w:val="single" w:sz="4" w:space="0" w:color="D9D9D9"/>
-              <w:insideV w:val="single" w:sz="4" w:space="0" w:color="D9D9D9"/>
-            </w:tcBorders>
-            <w:tcMar>
-              <w:top w:w="80" w:type="dxa"/>
-              <w:start w:w="100" w:type="dxa"/>
-              <w:bottom w:w="80" w:type="dxa"/>
-              <w:end w:w="100" w:type="dxa"/>
-            </w:tcMar>
-            <w:vAlign w:val="center"/>
-          </w:tcPr>
-          <w:p>
-            <w:r>
-              <w:rPr>
-                <w:rFonts w:ascii="Arial" w:hAnsi="Arial"/>
-                <w:sz w:val="20"/>
-              </w:rPr>
-              <w:t>Bodega Norte – [completar ubicación]</w:t>
-            </w:r>
-          </w:p>
-        </w:tc>
-      </w:tr>
-      <w:tr>
-        <w:tc>
-          <w:tcPr>
-            <w:tcW w:type="dxa" w:w="4320"/>
-            <w:shd w:fill="EAF0F6"/>
-            <w:tcBorders>
-              <w:top w:val="single" w:sz="4" w:space="0" w:color="D9D9D9"/>
-              <w:left w:val="single" w:sz="4" w:space="0" w:color="D9D9D9"/>
-              <w:bottom w:val="single" w:sz="4" w:space="0" w:color="D9D9D9"/>
-              <w:right w:val="single" w:sz="4" w:space="0" w:color="D9D9D9"/>
-              <w:insideH w:val="single" w:sz="4" w:space="0" w:color="D9D9D9"/>
-              <w:insideV w:val="single" w:sz="4" w:space="0" w:color="D9D9D9"/>
-            </w:tcBorders>
-            <w:tcMar>
-              <w:top w:w="80" w:type="dxa"/>
-              <w:start w:w="100" w:type="dxa"/>
-              <w:bottom w:w="80" w:type="dxa"/>
-              <w:end w:w="100" w:type="dxa"/>
-            </w:tcMar>
-            <w:vAlign w:val="center"/>
-          </w:tcPr>
-          <w:p>
-            <w:r>
-              <w:rPr>
-                <w:rFonts w:ascii="Arial" w:hAnsi="Arial"/>
-                <w:b/>
-                <w:color w:val="10294B"/>
-                <w:sz w:val="20"/>
-              </w:rPr>
-              <w:t>Fecha de entrega</w:t>
-            </w:r>
-          </w:p>
-        </w:tc>
-        <w:tc>
-          <w:tcPr>
-            <w:tcW w:type="dxa" w:w="4320"/>
-            <w:tcBorders>
-              <w:top w:val="single" w:sz="4" w:space="0" w:color="D9D9D9"/>
-              <w:left w:val="single" w:sz="4" w:space="0" w:color="D9D9D9"/>
-              <w:bottom w:val="single" w:sz="4" w:space="0" w:color="D9D9D9"/>
-              <w:right w:val="single" w:sz="4" w:space="0" w:color="D9D9D9"/>
-              <w:insideH w:val="single" w:sz="4" w:space="0" w:color="D9D9D9"/>
-              <w:insideV w:val="single" w:sz="4" w:space="0" w:color="D9D9D9"/>
-            </w:tcBorders>
-            <w:tcMar>
-              <w:top w:w="80" w:type="dxa"/>
-              <w:start w:w="100" w:type="dxa"/>
-              <w:bottom w:w="80" w:type="dxa"/>
-              <w:end w:w="100" w:type="dxa"/>
-            </w:tcMar>
-            <w:vAlign w:val="center"/>
-          </w:tcPr>
-          <w:p>
-            <w:r>
-              <w:rPr>
-                <w:rFonts w:ascii="Arial" w:hAnsi="Arial"/>
-                <w:sz w:val="20"/>
-              </w:rPr>
-              <w:t>[Completar]</w:t>
-            </w:r>
-          </w:p>
-        </w:tc>
-      </w:tr>
-    </w:tbl>
-    <w:p/>
     <w:p>
       <w:pPr>
         <w:jc w:val="center"/>
       </w:pPr>
       <w:r>
         <w:rPr>
-          <w:i/>
-          <w:color w:val="6B7280"/>
-          <w:sz w:val="18"/>
+          <w:rFonts w:ascii="Arial" w:hAnsi="Arial" w:eastAsia="Arial"/>
+          <w:color w:val="000000"/>
+          <w:sz w:val="22"/>
         </w:rPr>
-        <w:t>Elaborado a partir de la estructura y criterios indicados en los documentos de referencia del curso.</w:t>
+        <w:t>Ciclo cuarto | Periodo 2026 | Semestre no consignado en los documentos recibidos</w:t>
+      </w:r>
+    </w:p>
+    <w:p>
+      <w:pPr>
+        <w:jc w:val="center"/>
+      </w:pPr>
+      <w:r>
+        <w:rPr>
+          <w:rFonts w:ascii="Arial" w:hAnsi="Arial" w:eastAsia="Arial"/>
+          <w:color w:val="000000"/>
+          <w:sz w:val="22"/>
+        </w:rPr>
+        <w:t>Grupo 10</w:t>
+      </w:r>
+    </w:p>
+    <w:p/>
+    <w:p>
+      <w:pPr>
+        <w:jc w:val="left"/>
+      </w:pPr>
+      <w:r>
+        <w:rPr>
+          <w:rFonts w:ascii="Arial" w:hAnsi="Arial" w:eastAsia="Arial"/>
+          <w:color w:val="000000"/>
+          <w:sz w:val="22"/>
+        </w:rPr>
+        <w:t>Coordinador: Gonzalo Yoel Choque Becerra</w:t>
       </w:r>
     </w:p>
     <w:p>
       <w:r>
+        <w:rPr>
+          <w:rFonts w:ascii="Arial" w:hAnsi="Arial" w:eastAsia="Arial"/>
+          <w:color w:val="000000"/>
+          <w:sz w:val="22"/>
+        </w:rPr>
+        <w:t>Integrantes: Adrian Alexander Berrocal Villanueva; Lalo Alessandro Eugenio Montalvo; Juan Diego Romero Peralta</w:t>
+      </w:r>
+    </w:p>
+    <w:p>
+      <w:r>
+        <w:rPr>
+          <w:rFonts w:ascii="Arial" w:hAnsi="Arial" w:eastAsia="Arial"/>
+          <w:color w:val="000000"/>
+          <w:sz w:val="22"/>
+        </w:rPr>
+        <w:t>Fecha de elaboración: 4 de octubre de 2026</w:t>
+      </w:r>
+    </w:p>
+    <w:p>
+      <w:r>
+        <w:rPr>
+          <w:rFonts w:ascii="Arial" w:hAnsi="Arial" w:eastAsia="Arial"/>
+          <w:color w:val="000000"/>
+          <w:sz w:val="22"/>
+        </w:rPr>
         <w:br w:type="page"/>
       </w:r>
     </w:p>
     <w:p>
       <w:pPr>
         <w:pStyle w:val="Heading1"/>
+        <w:keepNext/>
+        <w:keepLines/>
       </w:pPr>
       <w:r>
+        <w:rPr>
+          <w:rFonts w:ascii="Arial" w:hAnsi="Arial" w:eastAsia="Arial"/>
+          <w:color w:val="000000"/>
+          <w:sz w:val="22"/>
+        </w:rPr>
         <w:t>1. Propósito</w:t>
       </w:r>
     </w:p>
     <w:p>
       <w:r>
-        <w:t>Este documento consolida el cronograma del proyecto EFSR14908 y relaciona cada hito con los documentos Word que deben presentarse. Las fechas exactas deben completarse con el archivo de cronograma publicado en el aula virtual.</w:t>
+        <w:rPr>
+          <w:rFonts w:ascii="Arial" w:hAnsi="Arial" w:eastAsia="Arial"/>
+          <w:color w:val="000000"/>
+          <w:sz w:val="22"/>
+        </w:rPr>
+        <w:t>Este plan organiza las tareas del prototipo por semanas relativas, con subtareas y productos verificables. No representa un registro histórico de asistencia ni acredita que cada actividad se haya ejecutado en la semana indicada.</w:t>
       </w:r>
     </w:p>
     <w:p>
       <w:pPr>
         <w:pStyle w:val="Heading1"/>
+        <w:keepNext/>
+        <w:keepLines/>
       </w:pPr>
       <w:r>
-        <w:t>2. Cronograma académico de referencia</w:t>
-      </w:r>
-    </w:p>
-    <w:tbl>
-      <w:tblPr>
-        <w:tblStyle w:val="TableGrid"/>
-        <w:tblW w:type="auto" w:w="0"/>
-        <w:jc w:val="center"/>
-        <w:tblLook w:firstColumn="1" w:firstRow="1" w:lastColumn="0" w:lastRow="0" w:noHBand="0" w:noVBand="1" w:val="04A0"/>
-      </w:tblPr>
-      <w:tblGrid>
-        <w:gridCol w:w="2160"/>
-        <w:gridCol w:w="2160"/>
-        <w:gridCol w:w="2160"/>
-        <w:gridCol w:w="2160"/>
-      </w:tblGrid>
-      <w:tr>
-        <w:trPr>
-          <w:tblHeader w:val="true"/>
-        </w:trPr>
-        <w:tc>
-          <w:tcPr>
-            <w:tcW w:type="dxa" w:w="2160"/>
-            <w:shd w:fill="10294B"/>
-            <w:tcBorders>
-              <w:top w:val="single" w:sz="4" w:space="0" w:color="10294B"/>
-              <w:left w:val="single" w:sz="4" w:space="0" w:color="10294B"/>
-              <w:bottom w:val="single" w:sz="4" w:space="0" w:color="10294B"/>
-              <w:right w:val="single" w:sz="4" w:space="0" w:color="10294B"/>
-              <w:insideH w:val="single" w:sz="4" w:space="0" w:color="10294B"/>
-              <w:insideV w:val="single" w:sz="4" w:space="0" w:color="10294B"/>
-            </w:tcBorders>
-            <w:tcMar>
-              <w:top w:w="80" w:type="dxa"/>
-              <w:start w:w="100" w:type="dxa"/>
-              <w:bottom w:w="80" w:type="dxa"/>
-              <w:end w:w="100" w:type="dxa"/>
-            </w:tcMar>
-          </w:tcPr>
-          <w:p>
-            <w:r>
-              <w:rPr>
-                <w:rFonts w:ascii="Arial" w:hAnsi="Arial"/>
-                <w:b/>
-                <w:color w:val="FFFFFF"/>
-                <w:sz w:val="18"/>
-              </w:rPr>
-              <w:t>Hito</w:t>
-            </w:r>
-          </w:p>
-        </w:tc>
-        <w:tc>
-          <w:tcPr>
-            <w:tcW w:type="dxa" w:w="2160"/>
-            <w:shd w:fill="10294B"/>
-            <w:tcBorders>
-              <w:top w:val="single" w:sz="4" w:space="0" w:color="10294B"/>
-              <w:left w:val="single" w:sz="4" w:space="0" w:color="10294B"/>
-              <w:bottom w:val="single" w:sz="4" w:space="0" w:color="10294B"/>
-              <w:right w:val="single" w:sz="4" w:space="0" w:color="10294B"/>
-              <w:insideH w:val="single" w:sz="4" w:space="0" w:color="10294B"/>
-              <w:insideV w:val="single" w:sz="4" w:space="0" w:color="10294B"/>
-            </w:tcBorders>
-            <w:tcMar>
-              <w:top w:w="80" w:type="dxa"/>
-              <w:start w:w="100" w:type="dxa"/>
-              <w:bottom w:w="80" w:type="dxa"/>
-              <w:end w:w="100" w:type="dxa"/>
-            </w:tcMar>
-          </w:tcPr>
-          <w:p>
-            <w:r>
-              <w:rPr>
-                <w:rFonts w:ascii="Arial" w:hAnsi="Arial"/>
-                <w:b/>
-                <w:color w:val="FFFFFF"/>
-                <w:sz w:val="18"/>
-              </w:rPr>
-              <w:t>Semana / referencia</w:t>
-            </w:r>
-          </w:p>
-        </w:tc>
-        <w:tc>
-          <w:tcPr>
-            <w:tcW w:type="dxa" w:w="2160"/>
-            <w:shd w:fill="10294B"/>
-            <w:tcBorders>
-              <w:top w:val="single" w:sz="4" w:space="0" w:color="10294B"/>
-              <w:left w:val="single" w:sz="4" w:space="0" w:color="10294B"/>
-              <w:bottom w:val="single" w:sz="4" w:space="0" w:color="10294B"/>
-              <w:right w:val="single" w:sz="4" w:space="0" w:color="10294B"/>
-              <w:insideH w:val="single" w:sz="4" w:space="0" w:color="10294B"/>
-              <w:insideV w:val="single" w:sz="4" w:space="0" w:color="10294B"/>
-            </w:tcBorders>
-            <w:tcMar>
-              <w:top w:w="80" w:type="dxa"/>
-              <w:start w:w="100" w:type="dxa"/>
-              <w:bottom w:w="80" w:type="dxa"/>
-              <w:end w:w="100" w:type="dxa"/>
-            </w:tcMar>
-          </w:tcPr>
-          <w:p>
-            <w:r>
-              <w:rPr>
-                <w:rFonts w:ascii="Arial" w:hAnsi="Arial"/>
-                <w:b/>
-                <w:color w:val="FFFFFF"/>
-                <w:sz w:val="18"/>
-              </w:rPr>
-              <w:t>Contenido</w:t>
-            </w:r>
-          </w:p>
-        </w:tc>
-        <w:tc>
-          <w:tcPr>
-            <w:tcW w:type="dxa" w:w="2160"/>
-            <w:shd w:fill="10294B"/>
-            <w:tcBorders>
-              <w:top w:val="single" w:sz="4" w:space="0" w:color="10294B"/>
-              <w:left w:val="single" w:sz="4" w:space="0" w:color="10294B"/>
-              <w:bottom w:val="single" w:sz="4" w:space="0" w:color="10294B"/>
-              <w:right w:val="single" w:sz="4" w:space="0" w:color="10294B"/>
-              <w:insideH w:val="single" w:sz="4" w:space="0" w:color="10294B"/>
-              <w:insideV w:val="single" w:sz="4" w:space="0" w:color="10294B"/>
-            </w:tcBorders>
-            <w:tcMar>
-              <w:top w:w="80" w:type="dxa"/>
-              <w:start w:w="100" w:type="dxa"/>
-              <w:bottom w:w="80" w:type="dxa"/>
-              <w:end w:w="100" w:type="dxa"/>
-            </w:tcMar>
-          </w:tcPr>
-          <w:p>
-            <w:r>
-              <w:rPr>
-                <w:rFonts w:ascii="Arial" w:hAnsi="Arial"/>
-                <w:b/>
-                <w:color w:val="FFFFFF"/>
-                <w:sz w:val="18"/>
-              </w:rPr>
-              <w:t>Documento Word</w:t>
-            </w:r>
-          </w:p>
-        </w:tc>
-      </w:tr>
-      <w:tr>
-        <w:tc>
-          <w:tcPr>
-            <w:tcW w:type="dxa" w:w="2160"/>
-            <w:shd w:fill="F7F9FB"/>
-            <w:tcBorders>
-              <w:top w:val="single" w:sz="4" w:space="0" w:color="D9D9D9"/>
-              <w:left w:val="single" w:sz="4" w:space="0" w:color="D9D9D9"/>
-              <w:bottom w:val="single" w:sz="4" w:space="0" w:color="D9D9D9"/>
-              <w:right w:val="single" w:sz="4" w:space="0" w:color="D9D9D9"/>
-              <w:insideH w:val="single" w:sz="4" w:space="0" w:color="D9D9D9"/>
-              <w:insideV w:val="single" w:sz="4" w:space="0" w:color="D9D9D9"/>
-            </w:tcBorders>
-            <w:tcMar>
-              <w:top w:w="80" w:type="dxa"/>
-              <w:start w:w="100" w:type="dxa"/>
-              <w:bottom w:w="80" w:type="dxa"/>
-              <w:end w:w="100" w:type="dxa"/>
-            </w:tcMar>
-            <w:vAlign w:val="center"/>
-          </w:tcPr>
-          <w:p>
-            <w:r>
-              <w:rPr>
-                <w:rFonts w:ascii="Arial" w:hAnsi="Arial"/>
-                <w:color w:val="222222"/>
-                <w:sz w:val="18"/>
-              </w:rPr>
-              <w:t>Entregable 1</w:t>
-            </w:r>
-          </w:p>
-        </w:tc>
-        <w:tc>
-          <w:tcPr>
-            <w:tcW w:type="dxa" w:w="2160"/>
-            <w:shd w:fill="F7F9FB"/>
-            <w:tcBorders>
-              <w:top w:val="single" w:sz="4" w:space="0" w:color="D9D9D9"/>
-              <w:left w:val="single" w:sz="4" w:space="0" w:color="D9D9D9"/>
-              <w:bottom w:val="single" w:sz="4" w:space="0" w:color="D9D9D9"/>
-              <w:right w:val="single" w:sz="4" w:space="0" w:color="D9D9D9"/>
-              <w:insideH w:val="single" w:sz="4" w:space="0" w:color="D9D9D9"/>
-              <w:insideV w:val="single" w:sz="4" w:space="0" w:color="D9D9D9"/>
-            </w:tcBorders>
-            <w:tcMar>
-              <w:top w:w="80" w:type="dxa"/>
-              <w:start w:w="100" w:type="dxa"/>
-              <w:bottom w:w="80" w:type="dxa"/>
-              <w:end w:w="100" w:type="dxa"/>
-            </w:tcMar>
-            <w:vAlign w:val="center"/>
-          </w:tcPr>
-          <w:p>
-            <w:r>
-              <w:rPr>
-                <w:rFonts w:ascii="Arial" w:hAnsi="Arial"/>
-                <w:color w:val="222222"/>
-                <w:sz w:val="18"/>
-              </w:rPr>
-              <w:t>Próxima semana según anuncio de semana 2</w:t>
-            </w:r>
-          </w:p>
-        </w:tc>
-        <w:tc>
-          <w:tcPr>
-            <w:tcW w:type="dxa" w:w="2160"/>
-            <w:shd w:fill="F7F9FB"/>
-            <w:tcBorders>
-              <w:top w:val="single" w:sz="4" w:space="0" w:color="D9D9D9"/>
-              <w:left w:val="single" w:sz="4" w:space="0" w:color="D9D9D9"/>
-              <w:bottom w:val="single" w:sz="4" w:space="0" w:color="D9D9D9"/>
-              <w:right w:val="single" w:sz="4" w:space="0" w:color="D9D9D9"/>
-              <w:insideH w:val="single" w:sz="4" w:space="0" w:color="D9D9D9"/>
-              <w:insideV w:val="single" w:sz="4" w:space="0" w:color="D9D9D9"/>
-            </w:tcBorders>
-            <w:tcMar>
-              <w:top w:w="80" w:type="dxa"/>
-              <w:start w:w="100" w:type="dxa"/>
-              <w:bottom w:w="80" w:type="dxa"/>
-              <w:end w:w="100" w:type="dxa"/>
-            </w:tcMar>
-            <w:vAlign w:val="center"/>
-          </w:tcPr>
-          <w:p>
-            <w:r>
-              <w:rPr>
-                <w:rFonts w:ascii="Arial" w:hAnsi="Arial"/>
-                <w:color w:val="222222"/>
-                <w:sz w:val="18"/>
-              </w:rPr>
-              <w:t>Capítulos I y II: diagnóstico, objetivos, justificación, alcance y propuesta.</w:t>
-            </w:r>
-          </w:p>
-        </w:tc>
-        <w:tc>
-          <w:tcPr>
-            <w:tcW w:type="dxa" w:w="2160"/>
-            <w:shd w:fill="F7F9FB"/>
-            <w:tcBorders>
-              <w:top w:val="single" w:sz="4" w:space="0" w:color="D9D9D9"/>
-              <w:left w:val="single" w:sz="4" w:space="0" w:color="D9D9D9"/>
-              <w:bottom w:val="single" w:sz="4" w:space="0" w:color="D9D9D9"/>
-              <w:right w:val="single" w:sz="4" w:space="0" w:color="D9D9D9"/>
-              <w:insideH w:val="single" w:sz="4" w:space="0" w:color="D9D9D9"/>
-              <w:insideV w:val="single" w:sz="4" w:space="0" w:color="D9D9D9"/>
-            </w:tcBorders>
-            <w:tcMar>
-              <w:top w:w="80" w:type="dxa"/>
-              <w:start w:w="100" w:type="dxa"/>
-              <w:bottom w:w="80" w:type="dxa"/>
-              <w:end w:w="100" w:type="dxa"/>
-            </w:tcMar>
-            <w:vAlign w:val="center"/>
-          </w:tcPr>
-          <w:p>
-            <w:r>
-              <w:rPr>
-                <w:rFonts w:ascii="Arial" w:hAnsi="Arial"/>
-                <w:color w:val="222222"/>
-                <w:sz w:val="18"/>
-              </w:rPr>
-              <w:t>01_Entregable_1_Informe_Inicial.docx</w:t>
-            </w:r>
-          </w:p>
-        </w:tc>
-      </w:tr>
-      <w:tr>
-        <w:tc>
-          <w:tcPr>
-            <w:tcW w:type="dxa" w:w="2160"/>
-            <w:tcBorders>
-              <w:top w:val="single" w:sz="4" w:space="0" w:color="D9D9D9"/>
-              <w:left w:val="single" w:sz="4" w:space="0" w:color="D9D9D9"/>
-              <w:bottom w:val="single" w:sz="4" w:space="0" w:color="D9D9D9"/>
-              <w:right w:val="single" w:sz="4" w:space="0" w:color="D9D9D9"/>
-              <w:insideH w:val="single" w:sz="4" w:space="0" w:color="D9D9D9"/>
-              <w:insideV w:val="single" w:sz="4" w:space="0" w:color="D9D9D9"/>
-            </w:tcBorders>
-            <w:tcMar>
-              <w:top w:w="80" w:type="dxa"/>
-              <w:start w:w="100" w:type="dxa"/>
-              <w:bottom w:w="80" w:type="dxa"/>
-              <w:end w:w="100" w:type="dxa"/>
-            </w:tcMar>
-            <w:vAlign w:val="center"/>
-          </w:tcPr>
-          <w:p>
-            <w:r>
-              <w:rPr>
-                <w:rFonts w:ascii="Arial" w:hAnsi="Arial"/>
-                <w:color w:val="222222"/>
-                <w:sz w:val="18"/>
-              </w:rPr>
-              <w:t>Avance 50%</w:t>
-            </w:r>
-          </w:p>
-        </w:tc>
-        <w:tc>
-          <w:tcPr>
-            <w:tcW w:type="dxa" w:w="2160"/>
-            <w:tcBorders>
-              <w:top w:val="single" w:sz="4" w:space="0" w:color="D9D9D9"/>
-              <w:left w:val="single" w:sz="4" w:space="0" w:color="D9D9D9"/>
-              <w:bottom w:val="single" w:sz="4" w:space="0" w:color="D9D9D9"/>
-              <w:right w:val="single" w:sz="4" w:space="0" w:color="D9D9D9"/>
-              <w:insideH w:val="single" w:sz="4" w:space="0" w:color="D9D9D9"/>
-              <w:insideV w:val="single" w:sz="4" w:space="0" w:color="D9D9D9"/>
-            </w:tcBorders>
-            <w:tcMar>
-              <w:top w:w="80" w:type="dxa"/>
-              <w:start w:w="100" w:type="dxa"/>
-              <w:bottom w:w="80" w:type="dxa"/>
-              <w:end w:w="100" w:type="dxa"/>
-            </w:tcMar>
-            <w:vAlign w:val="center"/>
-          </w:tcPr>
-          <w:p>
-            <w:r>
-              <w:rPr>
-                <w:rFonts w:ascii="Arial" w:hAnsi="Arial"/>
-                <w:color w:val="222222"/>
-                <w:sz w:val="18"/>
-              </w:rPr>
-              <w:t>Semana 10 según Anexo 4 Nivel 2</w:t>
-            </w:r>
-          </w:p>
-        </w:tc>
-        <w:tc>
-          <w:tcPr>
-            <w:tcW w:type="dxa" w:w="2160"/>
-            <w:tcBorders>
-              <w:top w:val="single" w:sz="4" w:space="0" w:color="D9D9D9"/>
-              <w:left w:val="single" w:sz="4" w:space="0" w:color="D9D9D9"/>
-              <w:bottom w:val="single" w:sz="4" w:space="0" w:color="D9D9D9"/>
-              <w:right w:val="single" w:sz="4" w:space="0" w:color="D9D9D9"/>
-              <w:insideH w:val="single" w:sz="4" w:space="0" w:color="D9D9D9"/>
-              <w:insideV w:val="single" w:sz="4" w:space="0" w:color="D9D9D9"/>
-            </w:tcBorders>
-            <w:tcMar>
-              <w:top w:w="80" w:type="dxa"/>
-              <w:start w:w="100" w:type="dxa"/>
-              <w:bottom w:w="80" w:type="dxa"/>
-              <w:end w:w="100" w:type="dxa"/>
-            </w:tcMar>
-            <w:vAlign w:val="center"/>
-          </w:tcPr>
-          <w:p>
-            <w:r>
-              <w:rPr>
-                <w:rFonts w:ascii="Arial" w:hAnsi="Arial"/>
-                <w:color w:val="222222"/>
-                <w:sz w:val="18"/>
-              </w:rPr>
-              <w:t>Proyecto al menos 50% y defensa grupal.</w:t>
-            </w:r>
-          </w:p>
-        </w:tc>
-        <w:tc>
-          <w:tcPr>
-            <w:tcW w:type="dxa" w:w="2160"/>
-            <w:tcBorders>
-              <w:top w:val="single" w:sz="4" w:space="0" w:color="D9D9D9"/>
-              <w:left w:val="single" w:sz="4" w:space="0" w:color="D9D9D9"/>
-              <w:bottom w:val="single" w:sz="4" w:space="0" w:color="D9D9D9"/>
-              <w:right w:val="single" w:sz="4" w:space="0" w:color="D9D9D9"/>
-              <w:insideH w:val="single" w:sz="4" w:space="0" w:color="D9D9D9"/>
-              <w:insideV w:val="single" w:sz="4" w:space="0" w:color="D9D9D9"/>
-            </w:tcBorders>
-            <w:tcMar>
-              <w:top w:w="80" w:type="dxa"/>
-              <w:start w:w="100" w:type="dxa"/>
-              <w:bottom w:w="80" w:type="dxa"/>
-              <w:end w:w="100" w:type="dxa"/>
-            </w:tcMar>
-            <w:vAlign w:val="center"/>
-          </w:tcPr>
-          <w:p>
-            <w:r>
-              <w:rPr>
-                <w:rFonts w:ascii="Arial" w:hAnsi="Arial"/>
-                <w:color w:val="222222"/>
-                <w:sz w:val="18"/>
-              </w:rPr>
-              <w:t>02_Entregable_2_Avance_50.docx</w:t>
-            </w:r>
-          </w:p>
-        </w:tc>
-      </w:tr>
-      <w:tr>
-        <w:tc>
-          <w:tcPr>
-            <w:tcW w:type="dxa" w:w="2160"/>
-            <w:shd w:fill="F7F9FB"/>
-            <w:tcBorders>
-              <w:top w:val="single" w:sz="4" w:space="0" w:color="D9D9D9"/>
-              <w:left w:val="single" w:sz="4" w:space="0" w:color="D9D9D9"/>
-              <w:bottom w:val="single" w:sz="4" w:space="0" w:color="D9D9D9"/>
-              <w:right w:val="single" w:sz="4" w:space="0" w:color="D9D9D9"/>
-              <w:insideH w:val="single" w:sz="4" w:space="0" w:color="D9D9D9"/>
-              <w:insideV w:val="single" w:sz="4" w:space="0" w:color="D9D9D9"/>
-            </w:tcBorders>
-            <w:tcMar>
-              <w:top w:w="80" w:type="dxa"/>
-              <w:start w:w="100" w:type="dxa"/>
-              <w:bottom w:w="80" w:type="dxa"/>
-              <w:end w:w="100" w:type="dxa"/>
-            </w:tcMar>
-            <w:vAlign w:val="center"/>
-          </w:tcPr>
-          <w:p>
-            <w:r>
-              <w:rPr>
-                <w:rFonts w:ascii="Arial" w:hAnsi="Arial"/>
-                <w:color w:val="222222"/>
-                <w:sz w:val="18"/>
-              </w:rPr>
-              <w:t>Entrega final</w:t>
-            </w:r>
-          </w:p>
-        </w:tc>
-        <w:tc>
-          <w:tcPr>
-            <w:tcW w:type="dxa" w:w="2160"/>
-            <w:shd w:fill="F7F9FB"/>
-            <w:tcBorders>
-              <w:top w:val="single" w:sz="4" w:space="0" w:color="D9D9D9"/>
-              <w:left w:val="single" w:sz="4" w:space="0" w:color="D9D9D9"/>
-              <w:bottom w:val="single" w:sz="4" w:space="0" w:color="D9D9D9"/>
-              <w:right w:val="single" w:sz="4" w:space="0" w:color="D9D9D9"/>
-              <w:insideH w:val="single" w:sz="4" w:space="0" w:color="D9D9D9"/>
-              <w:insideV w:val="single" w:sz="4" w:space="0" w:color="D9D9D9"/>
-            </w:tcBorders>
-            <w:tcMar>
-              <w:top w:w="80" w:type="dxa"/>
-              <w:start w:w="100" w:type="dxa"/>
-              <w:bottom w:w="80" w:type="dxa"/>
-              <w:end w:w="100" w:type="dxa"/>
-            </w:tcMar>
-            <w:vAlign w:val="center"/>
-          </w:tcPr>
-          <w:p>
-            <w:r>
-              <w:rPr>
-                <w:rFonts w:ascii="Arial" w:hAnsi="Arial"/>
-                <w:color w:val="222222"/>
-                <w:sz w:val="18"/>
-              </w:rPr>
-              <w:t>Semana 13 según Anexo 4 Nivel 2</w:t>
-            </w:r>
-          </w:p>
-        </w:tc>
-        <w:tc>
-          <w:tcPr>
-            <w:tcW w:type="dxa" w:w="2160"/>
-            <w:shd w:fill="F7F9FB"/>
-            <w:tcBorders>
-              <w:top w:val="single" w:sz="4" w:space="0" w:color="D9D9D9"/>
-              <w:left w:val="single" w:sz="4" w:space="0" w:color="D9D9D9"/>
-              <w:bottom w:val="single" w:sz="4" w:space="0" w:color="D9D9D9"/>
-              <w:right w:val="single" w:sz="4" w:space="0" w:color="D9D9D9"/>
-              <w:insideH w:val="single" w:sz="4" w:space="0" w:color="D9D9D9"/>
-              <w:insideV w:val="single" w:sz="4" w:space="0" w:color="D9D9D9"/>
-            </w:tcBorders>
-            <w:tcMar>
-              <w:top w:w="80" w:type="dxa"/>
-              <w:start w:w="100" w:type="dxa"/>
-              <w:bottom w:w="80" w:type="dxa"/>
-              <w:end w:w="100" w:type="dxa"/>
-            </w:tcMar>
-            <w:vAlign w:val="center"/>
-          </w:tcPr>
-          <w:p>
-            <w:r>
-              <w:rPr>
-                <w:rFonts w:ascii="Arial" w:hAnsi="Arial"/>
-                <w:color w:val="222222"/>
-                <w:sz w:val="18"/>
-              </w:rPr>
-              <w:t>Proyecto 100% y defensa grupal.</w:t>
-            </w:r>
-          </w:p>
-        </w:tc>
-        <w:tc>
-          <w:tcPr>
-            <w:tcW w:type="dxa" w:w="2160"/>
-            <w:shd w:fill="F7F9FB"/>
-            <w:tcBorders>
-              <w:top w:val="single" w:sz="4" w:space="0" w:color="D9D9D9"/>
-              <w:left w:val="single" w:sz="4" w:space="0" w:color="D9D9D9"/>
-              <w:bottom w:val="single" w:sz="4" w:space="0" w:color="D9D9D9"/>
-              <w:right w:val="single" w:sz="4" w:space="0" w:color="D9D9D9"/>
-              <w:insideH w:val="single" w:sz="4" w:space="0" w:color="D9D9D9"/>
-              <w:insideV w:val="single" w:sz="4" w:space="0" w:color="D9D9D9"/>
-            </w:tcBorders>
-            <w:tcMar>
-              <w:top w:w="80" w:type="dxa"/>
-              <w:start w:w="100" w:type="dxa"/>
-              <w:bottom w:w="80" w:type="dxa"/>
-              <w:end w:w="100" w:type="dxa"/>
-            </w:tcMar>
-            <w:vAlign w:val="center"/>
-          </w:tcPr>
-          <w:p>
-            <w:r>
-              <w:rPr>
-                <w:rFonts w:ascii="Arial" w:hAnsi="Arial"/>
-                <w:color w:val="222222"/>
-                <w:sz w:val="18"/>
-              </w:rPr>
-              <w:t>03_Entrega_Final_Informe.docx</w:t>
-            </w:r>
-          </w:p>
-        </w:tc>
-      </w:tr>
-      <w:tr>
-        <w:tc>
-          <w:tcPr>
-            <w:tcW w:type="dxa" w:w="2160"/>
-            <w:tcBorders>
-              <w:top w:val="single" w:sz="4" w:space="0" w:color="D9D9D9"/>
-              <w:left w:val="single" w:sz="4" w:space="0" w:color="D9D9D9"/>
-              <w:bottom w:val="single" w:sz="4" w:space="0" w:color="D9D9D9"/>
-              <w:right w:val="single" w:sz="4" w:space="0" w:color="D9D9D9"/>
-              <w:insideH w:val="single" w:sz="4" w:space="0" w:color="D9D9D9"/>
-              <w:insideV w:val="single" w:sz="4" w:space="0" w:color="D9D9D9"/>
-            </w:tcBorders>
-            <w:tcMar>
-              <w:top w:w="80" w:type="dxa"/>
-              <w:start w:w="100" w:type="dxa"/>
-              <w:bottom w:w="80" w:type="dxa"/>
-              <w:end w:w="100" w:type="dxa"/>
-            </w:tcMar>
-            <w:vAlign w:val="center"/>
-          </w:tcPr>
-          <w:p>
-            <w:r>
-              <w:rPr>
-                <w:rFonts w:ascii="Arial" w:hAnsi="Arial"/>
-                <w:color w:val="222222"/>
-                <w:sz w:val="18"/>
-              </w:rPr>
-              <w:t>Evaluación del sílabo</w:t>
-            </w:r>
-          </w:p>
-        </w:tc>
-        <w:tc>
-          <w:tcPr>
-            <w:tcW w:type="dxa" w:w="2160"/>
-            <w:tcBorders>
-              <w:top w:val="single" w:sz="4" w:space="0" w:color="D9D9D9"/>
-              <w:left w:val="single" w:sz="4" w:space="0" w:color="D9D9D9"/>
-              <w:bottom w:val="single" w:sz="4" w:space="0" w:color="D9D9D9"/>
-              <w:right w:val="single" w:sz="4" w:space="0" w:color="D9D9D9"/>
-              <w:insideH w:val="single" w:sz="4" w:space="0" w:color="D9D9D9"/>
-              <w:insideV w:val="single" w:sz="4" w:space="0" w:color="D9D9D9"/>
-            </w:tcBorders>
-            <w:tcMar>
-              <w:top w:w="80" w:type="dxa"/>
-              <w:start w:w="100" w:type="dxa"/>
-              <w:bottom w:w="80" w:type="dxa"/>
-              <w:end w:w="100" w:type="dxa"/>
-            </w:tcMar>
-            <w:vAlign w:val="center"/>
-          </w:tcPr>
-          <w:p>
-            <w:r>
-              <w:rPr>
-                <w:rFonts w:ascii="Arial" w:hAnsi="Arial"/>
-                <w:color w:val="222222"/>
-                <w:sz w:val="18"/>
-              </w:rPr>
-              <w:t>Semana 07 según Silabo_del_curso (10).pdf</w:t>
-            </w:r>
-          </w:p>
-        </w:tc>
-        <w:tc>
-          <w:tcPr>
-            <w:tcW w:type="dxa" w:w="2160"/>
-            <w:tcBorders>
-              <w:top w:val="single" w:sz="4" w:space="0" w:color="D9D9D9"/>
-              <w:left w:val="single" w:sz="4" w:space="0" w:color="D9D9D9"/>
-              <w:bottom w:val="single" w:sz="4" w:space="0" w:color="D9D9D9"/>
-              <w:right w:val="single" w:sz="4" w:space="0" w:color="D9D9D9"/>
-              <w:insideH w:val="single" w:sz="4" w:space="0" w:color="D9D9D9"/>
-              <w:insideV w:val="single" w:sz="4" w:space="0" w:color="D9D9D9"/>
-            </w:tcBorders>
-            <w:tcMar>
-              <w:top w:w="80" w:type="dxa"/>
-              <w:start w:w="100" w:type="dxa"/>
-              <w:bottom w:w="80" w:type="dxa"/>
-              <w:end w:w="100" w:type="dxa"/>
-            </w:tcMar>
-            <w:vAlign w:val="center"/>
-          </w:tcPr>
-          <w:p>
-            <w:r>
-              <w:rPr>
-                <w:rFonts w:ascii="Arial" w:hAnsi="Arial"/>
-                <w:color w:val="222222"/>
-                <w:sz w:val="18"/>
-              </w:rPr>
-              <w:t>Evaluación final / entrega del proyecto.</w:t>
-            </w:r>
-          </w:p>
-        </w:tc>
-        <w:tc>
-          <w:tcPr>
-            <w:tcW w:type="dxa" w:w="2160"/>
-            <w:tcBorders>
-              <w:top w:val="single" w:sz="4" w:space="0" w:color="D9D9D9"/>
-              <w:left w:val="single" w:sz="4" w:space="0" w:color="D9D9D9"/>
-              <w:bottom w:val="single" w:sz="4" w:space="0" w:color="D9D9D9"/>
-              <w:right w:val="single" w:sz="4" w:space="0" w:color="D9D9D9"/>
-              <w:insideH w:val="single" w:sz="4" w:space="0" w:color="D9D9D9"/>
-              <w:insideV w:val="single" w:sz="4" w:space="0" w:color="D9D9D9"/>
-            </w:tcBorders>
-            <w:tcMar>
-              <w:top w:w="80" w:type="dxa"/>
-              <w:start w:w="100" w:type="dxa"/>
-              <w:bottom w:w="80" w:type="dxa"/>
-              <w:end w:w="100" w:type="dxa"/>
-            </w:tcMar>
-            <w:vAlign w:val="center"/>
-          </w:tcPr>
-          <w:p>
-            <w:r>
-              <w:rPr>
-                <w:rFonts w:ascii="Arial" w:hAnsi="Arial"/>
-                <w:color w:val="222222"/>
-                <w:sz w:val="18"/>
-              </w:rPr>
-              <w:t>Verificar fecha en aula virtual.</w:t>
-            </w:r>
-          </w:p>
-        </w:tc>
-      </w:tr>
-      <w:tr>
-        <w:tc>
-          <w:tcPr>
-            <w:tcW w:type="dxa" w:w="2160"/>
-            <w:shd w:fill="F7F9FB"/>
-            <w:tcBorders>
-              <w:top w:val="single" w:sz="4" w:space="0" w:color="D9D9D9"/>
-              <w:left w:val="single" w:sz="4" w:space="0" w:color="D9D9D9"/>
-              <w:bottom w:val="single" w:sz="4" w:space="0" w:color="D9D9D9"/>
-              <w:right w:val="single" w:sz="4" w:space="0" w:color="D9D9D9"/>
-              <w:insideH w:val="single" w:sz="4" w:space="0" w:color="D9D9D9"/>
-              <w:insideV w:val="single" w:sz="4" w:space="0" w:color="D9D9D9"/>
-            </w:tcBorders>
-            <w:tcMar>
-              <w:top w:w="80" w:type="dxa"/>
-              <w:start w:w="100" w:type="dxa"/>
-              <w:bottom w:w="80" w:type="dxa"/>
-              <w:end w:w="100" w:type="dxa"/>
-            </w:tcMar>
-            <w:vAlign w:val="center"/>
-          </w:tcPr>
-          <w:p>
-            <w:r>
-              <w:rPr>
-                <w:rFonts w:ascii="Arial" w:hAnsi="Arial"/>
-                <w:color w:val="222222"/>
-                <w:sz w:val="18"/>
-              </w:rPr>
-              <w:t>Microcertificaciones</w:t>
-            </w:r>
-          </w:p>
-        </w:tc>
-        <w:tc>
-          <w:tcPr>
-            <w:tcW w:type="dxa" w:w="2160"/>
-            <w:shd w:fill="F7F9FB"/>
-            <w:tcBorders>
-              <w:top w:val="single" w:sz="4" w:space="0" w:color="D9D9D9"/>
-              <w:left w:val="single" w:sz="4" w:space="0" w:color="D9D9D9"/>
-              <w:bottom w:val="single" w:sz="4" w:space="0" w:color="D9D9D9"/>
-              <w:right w:val="single" w:sz="4" w:space="0" w:color="D9D9D9"/>
-              <w:insideH w:val="single" w:sz="4" w:space="0" w:color="D9D9D9"/>
-              <w:insideV w:val="single" w:sz="4" w:space="0" w:color="D9D9D9"/>
-            </w:tcBorders>
-            <w:tcMar>
-              <w:top w:w="80" w:type="dxa"/>
-              <w:start w:w="100" w:type="dxa"/>
-              <w:bottom w:w="80" w:type="dxa"/>
-              <w:end w:w="100" w:type="dxa"/>
-            </w:tcMar>
-            <w:vAlign w:val="center"/>
-          </w:tcPr>
-          <w:p>
-            <w:r>
-              <w:rPr>
-                <w:rFonts w:ascii="Arial" w:hAnsi="Arial"/>
-                <w:color w:val="222222"/>
-                <w:sz w:val="18"/>
-              </w:rPr>
-              <w:t>Semana 08 según Silabo_del_curso (10).pdf</w:t>
-            </w:r>
-          </w:p>
-        </w:tc>
-        <w:tc>
-          <w:tcPr>
-            <w:tcW w:type="dxa" w:w="2160"/>
-            <w:shd w:fill="F7F9FB"/>
-            <w:tcBorders>
-              <w:top w:val="single" w:sz="4" w:space="0" w:color="D9D9D9"/>
-              <w:left w:val="single" w:sz="4" w:space="0" w:color="D9D9D9"/>
-              <w:bottom w:val="single" w:sz="4" w:space="0" w:color="D9D9D9"/>
-              <w:right w:val="single" w:sz="4" w:space="0" w:color="D9D9D9"/>
-              <w:insideH w:val="single" w:sz="4" w:space="0" w:color="D9D9D9"/>
-              <w:insideV w:val="single" w:sz="4" w:space="0" w:color="D9D9D9"/>
-            </w:tcBorders>
-            <w:tcMar>
-              <w:top w:w="80" w:type="dxa"/>
-              <w:start w:w="100" w:type="dxa"/>
-              <w:bottom w:w="80" w:type="dxa"/>
-              <w:end w:w="100" w:type="dxa"/>
-            </w:tcMar>
-            <w:vAlign w:val="center"/>
-          </w:tcPr>
-          <w:p>
-            <w:r>
-              <w:rPr>
-                <w:rFonts w:ascii="Arial" w:hAnsi="Arial"/>
-                <w:color w:val="222222"/>
-                <w:sz w:val="18"/>
-              </w:rPr>
-              <w:t>Actividad posterior indicada en el sílabo.</w:t>
-            </w:r>
-          </w:p>
-        </w:tc>
-        <w:tc>
-          <w:tcPr>
-            <w:tcW w:type="dxa" w:w="2160"/>
-            <w:shd w:fill="F7F9FB"/>
-            <w:tcBorders>
-              <w:top w:val="single" w:sz="4" w:space="0" w:color="D9D9D9"/>
-              <w:left w:val="single" w:sz="4" w:space="0" w:color="D9D9D9"/>
-              <w:bottom w:val="single" w:sz="4" w:space="0" w:color="D9D9D9"/>
-              <w:right w:val="single" w:sz="4" w:space="0" w:color="D9D9D9"/>
-              <w:insideH w:val="single" w:sz="4" w:space="0" w:color="D9D9D9"/>
-              <w:insideV w:val="single" w:sz="4" w:space="0" w:color="D9D9D9"/>
-            </w:tcBorders>
-            <w:tcMar>
-              <w:top w:w="80" w:type="dxa"/>
-              <w:start w:w="100" w:type="dxa"/>
-              <w:bottom w:w="80" w:type="dxa"/>
-              <w:end w:w="100" w:type="dxa"/>
-            </w:tcMar>
-            <w:vAlign w:val="center"/>
-          </w:tcPr>
-          <w:p>
-            <w:r>
-              <w:rPr>
-                <w:rFonts w:ascii="Arial" w:hAnsi="Arial"/>
-                <w:color w:val="222222"/>
-                <w:sz w:val="18"/>
-              </w:rPr>
-              <w:t>Según indicación docente.</w:t>
-            </w:r>
-          </w:p>
-        </w:tc>
-      </w:tr>
-    </w:tbl>
-    <w:p/>
-    <w:p>
-      <w:pPr>
-        <w:pStyle w:val="Heading1"/>
-      </w:pPr>
-      <w:r>
-        <w:t>3. Plan semanal de trabajo</w:t>
+        <w:rPr>
+          <w:rFonts w:ascii="Arial" w:hAnsi="Arial" w:eastAsia="Arial"/>
+          <w:color w:val="000000"/>
+          <w:sz w:val="22"/>
+        </w:rPr>
+        <w:t>2. Hitos del curso</w:t>
       </w:r>
     </w:p>
     <w:tbl>
@@ -1389,19 +184,20 @@
       </w:tblGrid>
       <w:tr>
         <w:trPr>
+          <w:cantSplit/>
           <w:tblHeader w:val="true"/>
         </w:trPr>
         <w:tc>
           <w:tcPr>
             <w:tcW w:type="dxa" w:w="2880"/>
-            <w:shd w:fill="10294B"/>
+            <w:shd w:fill="000000"/>
             <w:tcBorders>
-              <w:top w:val="single" w:sz="4" w:space="0" w:color="10294B"/>
-              <w:left w:val="single" w:sz="4" w:space="0" w:color="10294B"/>
-              <w:bottom w:val="single" w:sz="4" w:space="0" w:color="10294B"/>
-              <w:right w:val="single" w:sz="4" w:space="0" w:color="10294B"/>
-              <w:insideH w:val="single" w:sz="4" w:space="0" w:color="10294B"/>
-              <w:insideV w:val="single" w:sz="4" w:space="0" w:color="10294B"/>
+              <w:top w:val="single" w:sz="4" w:space="0" w:color="000000"/>
+              <w:left w:val="single" w:sz="4" w:space="0" w:color="000000"/>
+              <w:bottom w:val="single" w:sz="4" w:space="0" w:color="000000"/>
+              <w:right w:val="single" w:sz="4" w:space="0" w:color="000000"/>
+              <w:insideH w:val="single" w:sz="4" w:space="0" w:color="000000"/>
+              <w:insideV w:val="single" w:sz="4" w:space="0" w:color="000000"/>
             </w:tcBorders>
             <w:tcMar>
               <w:top w:w="80" w:type="dxa"/>
@@ -1411,28 +207,31 @@
             </w:tcMar>
           </w:tcPr>
           <w:p>
+            <w:pPr>
+              <w:keepNext/>
+            </w:pPr>
             <w:r>
               <w:rPr>
-                <w:rFonts w:ascii="Arial" w:hAnsi="Arial"/>
+                <w:rFonts w:ascii="Arial" w:hAnsi="Arial" w:eastAsia="Arial"/>
                 <w:b/>
                 <w:color w:val="FFFFFF"/>
-                <w:sz w:val="18"/>
+                <w:sz w:val="22"/>
               </w:rPr>
-              <w:t>Semana</w:t>
+              <w:t>Hito</w:t>
             </w:r>
           </w:p>
         </w:tc>
         <w:tc>
           <w:tcPr>
             <w:tcW w:type="dxa" w:w="2880"/>
-            <w:shd w:fill="10294B"/>
+            <w:shd w:fill="000000"/>
             <w:tcBorders>
-              <w:top w:val="single" w:sz="4" w:space="0" w:color="10294B"/>
-              <w:left w:val="single" w:sz="4" w:space="0" w:color="10294B"/>
-              <w:bottom w:val="single" w:sz="4" w:space="0" w:color="10294B"/>
-              <w:right w:val="single" w:sz="4" w:space="0" w:color="10294B"/>
-              <w:insideH w:val="single" w:sz="4" w:space="0" w:color="10294B"/>
-              <w:insideV w:val="single" w:sz="4" w:space="0" w:color="10294B"/>
+              <w:top w:val="single" w:sz="4" w:space="0" w:color="000000"/>
+              <w:left w:val="single" w:sz="4" w:space="0" w:color="000000"/>
+              <w:bottom w:val="single" w:sz="4" w:space="0" w:color="000000"/>
+              <w:right w:val="single" w:sz="4" w:space="0" w:color="000000"/>
+              <w:insideH w:val="single" w:sz="4" w:space="0" w:color="000000"/>
+              <w:insideV w:val="single" w:sz="4" w:space="0" w:color="000000"/>
             </w:tcBorders>
             <w:tcMar>
               <w:top w:w="80" w:type="dxa"/>
@@ -1442,28 +241,31 @@
             </w:tcMar>
           </w:tcPr>
           <w:p>
+            <w:pPr>
+              <w:keepNext/>
+            </w:pPr>
             <w:r>
               <w:rPr>
-                <w:rFonts w:ascii="Arial" w:hAnsi="Arial"/>
+                <w:rFonts w:ascii="Arial" w:hAnsi="Arial" w:eastAsia="Arial"/>
                 <w:b/>
                 <w:color w:val="FFFFFF"/>
-                <w:sz w:val="18"/>
+                <w:sz w:val="22"/>
               </w:rPr>
-              <w:t>Actividad</w:t>
+              <w:t>Referencia recibida</w:t>
             </w:r>
           </w:p>
         </w:tc>
         <w:tc>
           <w:tcPr>
             <w:tcW w:type="dxa" w:w="2880"/>
-            <w:shd w:fill="10294B"/>
+            <w:shd w:fill="000000"/>
             <w:tcBorders>
-              <w:top w:val="single" w:sz="4" w:space="0" w:color="10294B"/>
-              <w:left w:val="single" w:sz="4" w:space="0" w:color="10294B"/>
-              <w:bottom w:val="single" w:sz="4" w:space="0" w:color="10294B"/>
-              <w:right w:val="single" w:sz="4" w:space="0" w:color="10294B"/>
-              <w:insideH w:val="single" w:sz="4" w:space="0" w:color="10294B"/>
-              <w:insideV w:val="single" w:sz="4" w:space="0" w:color="10294B"/>
+              <w:top w:val="single" w:sz="4" w:space="0" w:color="000000"/>
+              <w:left w:val="single" w:sz="4" w:space="0" w:color="000000"/>
+              <w:bottom w:val="single" w:sz="4" w:space="0" w:color="000000"/>
+              <w:right w:val="single" w:sz="4" w:space="0" w:color="000000"/>
+              <w:insideH w:val="single" w:sz="4" w:space="0" w:color="000000"/>
+              <w:insideV w:val="single" w:sz="4" w:space="0" w:color="000000"/>
             </w:tcBorders>
             <w:tcMar>
               <w:top w:w="80" w:type="dxa"/>
@@ -1473,30 +275,36 @@
             </w:tcMar>
           </w:tcPr>
           <w:p>
+            <w:pPr>
+              <w:keepNext/>
+            </w:pPr>
             <w:r>
               <w:rPr>
-                <w:rFonts w:ascii="Arial" w:hAnsi="Arial"/>
+                <w:rFonts w:ascii="Arial" w:hAnsi="Arial" w:eastAsia="Arial"/>
                 <w:b/>
                 <w:color w:val="FFFFFF"/>
-                <w:sz w:val="18"/>
+                <w:sz w:val="22"/>
               </w:rPr>
-              <w:t>Evidencia</w:t>
+              <w:t>Contenido</w:t>
             </w:r>
           </w:p>
         </w:tc>
       </w:tr>
       <w:tr>
+        <w:trPr>
+          <w:cantSplit/>
+        </w:trPr>
         <w:tc>
           <w:tcPr>
             <w:tcW w:type="dxa" w:w="2880"/>
-            <w:shd w:fill="F7F9FB"/>
+            <w:shd w:fill="FFFFFF"/>
             <w:tcBorders>
-              <w:top w:val="single" w:sz="4" w:space="0" w:color="D9D9D9"/>
-              <w:left w:val="single" w:sz="4" w:space="0" w:color="D9D9D9"/>
-              <w:bottom w:val="single" w:sz="4" w:space="0" w:color="D9D9D9"/>
-              <w:right w:val="single" w:sz="4" w:space="0" w:color="D9D9D9"/>
-              <w:insideH w:val="single" w:sz="4" w:space="0" w:color="D9D9D9"/>
-              <w:insideV w:val="single" w:sz="4" w:space="0" w:color="D9D9D9"/>
+              <w:top w:val="single" w:sz="4" w:space="0" w:color="000000"/>
+              <w:left w:val="single" w:sz="4" w:space="0" w:color="000000"/>
+              <w:bottom w:val="single" w:sz="4" w:space="0" w:color="000000"/>
+              <w:right w:val="single" w:sz="4" w:space="0" w:color="000000"/>
+              <w:insideH w:val="single" w:sz="4" w:space="0" w:color="000000"/>
+              <w:insideV w:val="single" w:sz="4" w:space="0" w:color="000000"/>
             </w:tcBorders>
             <w:tcMar>
               <w:top w:w="80" w:type="dxa"/>
@@ -1509,25 +317,25 @@
           <w:p>
             <w:r>
               <w:rPr>
-                <w:rFonts w:ascii="Arial" w:hAnsi="Arial"/>
-                <w:color w:val="222222"/>
-                <w:sz w:val="18"/>
+                <w:rFonts w:ascii="Arial" w:hAnsi="Arial" w:eastAsia="Arial"/>
+                <w:color w:val="000000"/>
+                <w:sz w:val="22"/>
               </w:rPr>
-              <w:t>1</w:t>
+              <w:t>Entregable 1</w:t>
             </w:r>
           </w:p>
         </w:tc>
         <w:tc>
           <w:tcPr>
             <w:tcW w:type="dxa" w:w="2880"/>
-            <w:shd w:fill="F7F9FB"/>
+            <w:shd w:fill="FFFFFF"/>
             <w:tcBorders>
-              <w:top w:val="single" w:sz="4" w:space="0" w:color="D9D9D9"/>
-              <w:left w:val="single" w:sz="4" w:space="0" w:color="D9D9D9"/>
-              <w:bottom w:val="single" w:sz="4" w:space="0" w:color="D9D9D9"/>
-              <w:right w:val="single" w:sz="4" w:space="0" w:color="D9D9D9"/>
-              <w:insideH w:val="single" w:sz="4" w:space="0" w:color="D9D9D9"/>
-              <w:insideV w:val="single" w:sz="4" w:space="0" w:color="D9D9D9"/>
+              <w:top w:val="single" w:sz="4" w:space="0" w:color="000000"/>
+              <w:left w:val="single" w:sz="4" w:space="0" w:color="000000"/>
+              <w:bottom w:val="single" w:sz="4" w:space="0" w:color="000000"/>
+              <w:right w:val="single" w:sz="4" w:space="0" w:color="000000"/>
+              <w:insideH w:val="single" w:sz="4" w:space="0" w:color="000000"/>
+              <w:insideV w:val="single" w:sz="4" w:space="0" w:color="000000"/>
             </w:tcBorders>
             <w:tcMar>
               <w:top w:w="80" w:type="dxa"/>
@@ -1540,25 +348,25 @@
           <w:p>
             <w:r>
               <w:rPr>
-                <w:rFonts w:ascii="Arial" w:hAnsi="Arial"/>
-                <w:color w:val="222222"/>
-                <w:sz w:val="18"/>
+                <w:rFonts w:ascii="Arial" w:hAnsi="Arial" w:eastAsia="Arial"/>
+                <w:color w:val="000000"/>
+                <w:sz w:val="22"/>
               </w:rPr>
-              <w:t>Formación de grupos y selección del problema.</w:t>
+              <w:t>Aula virtual: 21–27 de septiembre de 2026</w:t>
             </w:r>
           </w:p>
         </w:tc>
         <w:tc>
           <w:tcPr>
             <w:tcW w:type="dxa" w:w="2880"/>
-            <w:shd w:fill="F7F9FB"/>
+            <w:shd w:fill="FFFFFF"/>
             <w:tcBorders>
-              <w:top w:val="single" w:sz="4" w:space="0" w:color="D9D9D9"/>
-              <w:left w:val="single" w:sz="4" w:space="0" w:color="D9D9D9"/>
-              <w:bottom w:val="single" w:sz="4" w:space="0" w:color="D9D9D9"/>
-              <w:right w:val="single" w:sz="4" w:space="0" w:color="D9D9D9"/>
-              <w:insideH w:val="single" w:sz="4" w:space="0" w:color="D9D9D9"/>
-              <w:insideV w:val="single" w:sz="4" w:space="0" w:color="D9D9D9"/>
+              <w:top w:val="single" w:sz="4" w:space="0" w:color="000000"/>
+              <w:left w:val="single" w:sz="4" w:space="0" w:color="000000"/>
+              <w:bottom w:val="single" w:sz="4" w:space="0" w:color="000000"/>
+              <w:right w:val="single" w:sz="4" w:space="0" w:color="000000"/>
+              <w:insideH w:val="single" w:sz="4" w:space="0" w:color="000000"/>
+              <w:insideV w:val="single" w:sz="4" w:space="0" w:color="000000"/>
             </w:tcBorders>
             <w:tcMar>
               <w:top w:w="80" w:type="dxa"/>
@@ -1571,26 +379,30 @@
           <w:p>
             <w:r>
               <w:rPr>
-                <w:rFonts w:ascii="Arial" w:hAnsi="Arial"/>
-                <w:color w:val="222222"/>
-                <w:sz w:val="18"/>
+                <w:rFonts w:ascii="Arial" w:hAnsi="Arial" w:eastAsia="Arial"/>
+                <w:color w:val="000000"/>
+                <w:sz w:val="22"/>
               </w:rPr>
-              <w:t>Lista de equipo y tema.</w:t>
+              <w:t>Informe del proyecto y hoja de seguimiento del grupo.</w:t>
             </w:r>
           </w:p>
         </w:tc>
       </w:tr>
       <w:tr>
+        <w:trPr>
+          <w:cantSplit/>
+        </w:trPr>
         <w:tc>
           <w:tcPr>
             <w:tcW w:type="dxa" w:w="2880"/>
+            <w:shd w:fill="FFFFFF"/>
             <w:tcBorders>
-              <w:top w:val="single" w:sz="4" w:space="0" w:color="D9D9D9"/>
-              <w:left w:val="single" w:sz="4" w:space="0" w:color="D9D9D9"/>
-              <w:bottom w:val="single" w:sz="4" w:space="0" w:color="D9D9D9"/>
-              <w:right w:val="single" w:sz="4" w:space="0" w:color="D9D9D9"/>
-              <w:insideH w:val="single" w:sz="4" w:space="0" w:color="D9D9D9"/>
-              <w:insideV w:val="single" w:sz="4" w:space="0" w:color="D9D9D9"/>
+              <w:top w:val="single" w:sz="4" w:space="0" w:color="000000"/>
+              <w:left w:val="single" w:sz="4" w:space="0" w:color="000000"/>
+              <w:bottom w:val="single" w:sz="4" w:space="0" w:color="000000"/>
+              <w:right w:val="single" w:sz="4" w:space="0" w:color="000000"/>
+              <w:insideH w:val="single" w:sz="4" w:space="0" w:color="000000"/>
+              <w:insideV w:val="single" w:sz="4" w:space="0" w:color="000000"/>
             </w:tcBorders>
             <w:tcMar>
               <w:top w:w="80" w:type="dxa"/>
@@ -1603,24 +415,25 @@
           <w:p>
             <w:r>
               <w:rPr>
-                <w:rFonts w:ascii="Arial" w:hAnsi="Arial"/>
-                <w:color w:val="222222"/>
-                <w:sz w:val="18"/>
+                <w:rFonts w:ascii="Arial" w:hAnsi="Arial" w:eastAsia="Arial"/>
+                <w:color w:val="000000"/>
+                <w:sz w:val="22"/>
               </w:rPr>
-              <w:t>2</w:t>
+              <w:t>Avance del proyecto</w:t>
             </w:r>
           </w:p>
         </w:tc>
         <w:tc>
           <w:tcPr>
             <w:tcW w:type="dxa" w:w="2880"/>
+            <w:shd w:fill="FFFFFF"/>
             <w:tcBorders>
-              <w:top w:val="single" w:sz="4" w:space="0" w:color="D9D9D9"/>
-              <w:left w:val="single" w:sz="4" w:space="0" w:color="D9D9D9"/>
-              <w:bottom w:val="single" w:sz="4" w:space="0" w:color="D9D9D9"/>
-              <w:right w:val="single" w:sz="4" w:space="0" w:color="D9D9D9"/>
-              <w:insideH w:val="single" w:sz="4" w:space="0" w:color="D9D9D9"/>
-              <w:insideV w:val="single" w:sz="4" w:space="0" w:color="D9D9D9"/>
+              <w:top w:val="single" w:sz="4" w:space="0" w:color="000000"/>
+              <w:left w:val="single" w:sz="4" w:space="0" w:color="000000"/>
+              <w:bottom w:val="single" w:sz="4" w:space="0" w:color="000000"/>
+              <w:right w:val="single" w:sz="4" w:space="0" w:color="000000"/>
+              <w:insideH w:val="single" w:sz="4" w:space="0" w:color="000000"/>
+              <w:insideV w:val="single" w:sz="4" w:space="0" w:color="000000"/>
             </w:tcBorders>
             <w:tcMar>
               <w:top w:w="80" w:type="dxa"/>
@@ -1633,24 +446,25 @@
           <w:p>
             <w:r>
               <w:rPr>
-                <w:rFonts w:ascii="Arial" w:hAnsi="Arial"/>
-                <w:color w:val="222222"/>
-                <w:sz w:val="18"/>
+                <w:rFonts w:ascii="Arial" w:hAnsi="Arial" w:eastAsia="Arial"/>
+                <w:color w:val="000000"/>
+                <w:sz w:val="22"/>
               </w:rPr>
-              <w:t>Inicio del proyecto y definición de capítulos I y II.</w:t>
+              <w:t>Semana 10 en Anexo 4 Nivel 2</w:t>
             </w:r>
           </w:p>
         </w:tc>
         <w:tc>
           <w:tcPr>
             <w:tcW w:type="dxa" w:w="2880"/>
+            <w:shd w:fill="FFFFFF"/>
             <w:tcBorders>
-              <w:top w:val="single" w:sz="4" w:space="0" w:color="D9D9D9"/>
-              <w:left w:val="single" w:sz="4" w:space="0" w:color="D9D9D9"/>
-              <w:bottom w:val="single" w:sz="4" w:space="0" w:color="D9D9D9"/>
-              <w:right w:val="single" w:sz="4" w:space="0" w:color="D9D9D9"/>
-              <w:insideH w:val="single" w:sz="4" w:space="0" w:color="D9D9D9"/>
-              <w:insideV w:val="single" w:sz="4" w:space="0" w:color="D9D9D9"/>
+              <w:top w:val="single" w:sz="4" w:space="0" w:color="000000"/>
+              <w:left w:val="single" w:sz="4" w:space="0" w:color="000000"/>
+              <w:bottom w:val="single" w:sz="4" w:space="0" w:color="000000"/>
+              <w:right w:val="single" w:sz="4" w:space="0" w:color="000000"/>
+              <w:insideH w:val="single" w:sz="4" w:space="0" w:color="000000"/>
+              <w:insideV w:val="single" w:sz="4" w:space="0" w:color="000000"/>
             </w:tcBorders>
             <w:tcMar>
               <w:top w:w="80" w:type="dxa"/>
@@ -1663,27 +477,30 @@
           <w:p>
             <w:r>
               <w:rPr>
-                <w:rFonts w:ascii="Arial" w:hAnsi="Arial"/>
-                <w:color w:val="222222"/>
-                <w:sz w:val="18"/>
+                <w:rFonts w:ascii="Arial" w:hAnsi="Arial" w:eastAsia="Arial"/>
+                <w:color w:val="000000"/>
+                <w:sz w:val="22"/>
               </w:rPr>
-              <w:t>Entregable 1 en Word.</w:t>
+              <w:t>Avance mínimo de 50 % y sustentación grupal.</w:t>
             </w:r>
           </w:p>
         </w:tc>
       </w:tr>
       <w:tr>
+        <w:trPr>
+          <w:cantSplit/>
+        </w:trPr>
         <w:tc>
           <w:tcPr>
             <w:tcW w:type="dxa" w:w="2880"/>
-            <w:shd w:fill="F7F9FB"/>
+            <w:shd w:fill="FFFFFF"/>
             <w:tcBorders>
-              <w:top w:val="single" w:sz="4" w:space="0" w:color="D9D9D9"/>
-              <w:left w:val="single" w:sz="4" w:space="0" w:color="D9D9D9"/>
-              <w:bottom w:val="single" w:sz="4" w:space="0" w:color="D9D9D9"/>
-              <w:right w:val="single" w:sz="4" w:space="0" w:color="D9D9D9"/>
-              <w:insideH w:val="single" w:sz="4" w:space="0" w:color="D9D9D9"/>
-              <w:insideV w:val="single" w:sz="4" w:space="0" w:color="D9D9D9"/>
+              <w:top w:val="single" w:sz="4" w:space="0" w:color="000000"/>
+              <w:left w:val="single" w:sz="4" w:space="0" w:color="000000"/>
+              <w:bottom w:val="single" w:sz="4" w:space="0" w:color="000000"/>
+              <w:right w:val="single" w:sz="4" w:space="0" w:color="000000"/>
+              <w:insideH w:val="single" w:sz="4" w:space="0" w:color="000000"/>
+              <w:insideV w:val="single" w:sz="4" w:space="0" w:color="000000"/>
             </w:tcBorders>
             <w:tcMar>
               <w:top w:w="80" w:type="dxa"/>
@@ -1696,25 +513,25 @@
           <w:p>
             <w:r>
               <w:rPr>
-                <w:rFonts w:ascii="Arial" w:hAnsi="Arial"/>
-                <w:color w:val="222222"/>
-                <w:sz w:val="18"/>
+                <w:rFonts w:ascii="Arial" w:hAnsi="Arial" w:eastAsia="Arial"/>
+                <w:color w:val="000000"/>
+                <w:sz w:val="22"/>
               </w:rPr>
-              <w:t>3–5</w:t>
+              <w:t>Evaluación final</w:t>
             </w:r>
           </w:p>
         </w:tc>
         <w:tc>
           <w:tcPr>
             <w:tcW w:type="dxa" w:w="2880"/>
-            <w:shd w:fill="F7F9FB"/>
+            <w:shd w:fill="FFFFFF"/>
             <w:tcBorders>
-              <w:top w:val="single" w:sz="4" w:space="0" w:color="D9D9D9"/>
-              <w:left w:val="single" w:sz="4" w:space="0" w:color="D9D9D9"/>
-              <w:bottom w:val="single" w:sz="4" w:space="0" w:color="D9D9D9"/>
-              <w:right w:val="single" w:sz="4" w:space="0" w:color="D9D9D9"/>
-              <w:insideH w:val="single" w:sz="4" w:space="0" w:color="D9D9D9"/>
-              <w:insideV w:val="single" w:sz="4" w:space="0" w:color="D9D9D9"/>
+              <w:top w:val="single" w:sz="4" w:space="0" w:color="000000"/>
+              <w:left w:val="single" w:sz="4" w:space="0" w:color="000000"/>
+              <w:bottom w:val="single" w:sz="4" w:space="0" w:color="000000"/>
+              <w:right w:val="single" w:sz="4" w:space="0" w:color="000000"/>
+              <w:insideH w:val="single" w:sz="4" w:space="0" w:color="000000"/>
+              <w:insideV w:val="single" w:sz="4" w:space="0" w:color="000000"/>
             </w:tcBorders>
             <w:tcMar>
               <w:top w:w="80" w:type="dxa"/>
@@ -1727,25 +544,25 @@
           <w:p>
             <w:r>
               <w:rPr>
-                <w:rFonts w:ascii="Arial" w:hAnsi="Arial"/>
-                <w:color w:val="222222"/>
-                <w:sz w:val="18"/>
+                <w:rFonts w:ascii="Arial" w:hAnsi="Arial" w:eastAsia="Arial"/>
+                <w:color w:val="000000"/>
+                <w:sz w:val="22"/>
               </w:rPr>
-              <w:t>Análisis, historias de usuario, alcance, diseño y base de datos.</w:t>
+              <w:t>Semana 07 en Sílabo EFSRT III 2026</w:t>
             </w:r>
           </w:p>
         </w:tc>
         <w:tc>
           <w:tcPr>
             <w:tcW w:type="dxa" w:w="2880"/>
-            <w:shd w:fill="F7F9FB"/>
+            <w:shd w:fill="FFFFFF"/>
             <w:tcBorders>
-              <w:top w:val="single" w:sz="4" w:space="0" w:color="D9D9D9"/>
-              <w:left w:val="single" w:sz="4" w:space="0" w:color="D9D9D9"/>
-              <w:bottom w:val="single" w:sz="4" w:space="0" w:color="D9D9D9"/>
-              <w:right w:val="single" w:sz="4" w:space="0" w:color="D9D9D9"/>
-              <w:insideH w:val="single" w:sz="4" w:space="0" w:color="D9D9D9"/>
-              <w:insideV w:val="single" w:sz="4" w:space="0" w:color="D9D9D9"/>
+              <w:top w:val="single" w:sz="4" w:space="0" w:color="000000"/>
+              <w:left w:val="single" w:sz="4" w:space="0" w:color="000000"/>
+              <w:bottom w:val="single" w:sz="4" w:space="0" w:color="000000"/>
+              <w:right w:val="single" w:sz="4" w:space="0" w:color="000000"/>
+              <w:insideH w:val="single" w:sz="4" w:space="0" w:color="000000"/>
+              <w:insideV w:val="single" w:sz="4" w:space="0" w:color="000000"/>
             </w:tcBorders>
             <w:tcMar>
               <w:top w:w="80" w:type="dxa"/>
@@ -1758,26 +575,30 @@
           <w:p>
             <w:r>
               <w:rPr>
-                <w:rFonts w:ascii="Arial" w:hAnsi="Arial"/>
-                <w:color w:val="222222"/>
-                <w:sz w:val="18"/>
+                <w:rFonts w:ascii="Arial" w:hAnsi="Arial" w:eastAsia="Arial"/>
+                <w:color w:val="000000"/>
+                <w:sz w:val="22"/>
               </w:rPr>
-              <w:t>Diagramas y backlog.</w:t>
+              <w:t>Evaluación final del curso.</w:t>
             </w:r>
           </w:p>
         </w:tc>
       </w:tr>
       <w:tr>
+        <w:trPr>
+          <w:cantSplit/>
+        </w:trPr>
         <w:tc>
           <w:tcPr>
             <w:tcW w:type="dxa" w:w="2880"/>
+            <w:shd w:fill="FFFFFF"/>
             <w:tcBorders>
-              <w:top w:val="single" w:sz="4" w:space="0" w:color="D9D9D9"/>
-              <w:left w:val="single" w:sz="4" w:space="0" w:color="D9D9D9"/>
-              <w:bottom w:val="single" w:sz="4" w:space="0" w:color="D9D9D9"/>
-              <w:right w:val="single" w:sz="4" w:space="0" w:color="D9D9D9"/>
-              <w:insideH w:val="single" w:sz="4" w:space="0" w:color="D9D9D9"/>
-              <w:insideV w:val="single" w:sz="4" w:space="0" w:color="D9D9D9"/>
+              <w:top w:val="single" w:sz="4" w:space="0" w:color="000000"/>
+              <w:left w:val="single" w:sz="4" w:space="0" w:color="000000"/>
+              <w:bottom w:val="single" w:sz="4" w:space="0" w:color="000000"/>
+              <w:right w:val="single" w:sz="4" w:space="0" w:color="000000"/>
+              <w:insideH w:val="single" w:sz="4" w:space="0" w:color="000000"/>
+              <w:insideV w:val="single" w:sz="4" w:space="0" w:color="000000"/>
             </w:tcBorders>
             <w:tcMar>
               <w:top w:w="80" w:type="dxa"/>
@@ -1790,24 +611,25 @@
           <w:p>
             <w:r>
               <w:rPr>
-                <w:rFonts w:ascii="Arial" w:hAnsi="Arial"/>
-                <w:color w:val="222222"/>
-                <w:sz w:val="18"/>
+                <w:rFonts w:ascii="Arial" w:hAnsi="Arial" w:eastAsia="Arial"/>
+                <w:color w:val="000000"/>
+                <w:sz w:val="22"/>
               </w:rPr>
-              <w:t>6–9</w:t>
+              <w:t>Entrega final</w:t>
             </w:r>
           </w:p>
         </w:tc>
         <w:tc>
           <w:tcPr>
             <w:tcW w:type="dxa" w:w="2880"/>
+            <w:shd w:fill="FFFFFF"/>
             <w:tcBorders>
-              <w:top w:val="single" w:sz="4" w:space="0" w:color="D9D9D9"/>
-              <w:left w:val="single" w:sz="4" w:space="0" w:color="D9D9D9"/>
-              <w:bottom w:val="single" w:sz="4" w:space="0" w:color="D9D9D9"/>
-              <w:right w:val="single" w:sz="4" w:space="0" w:color="D9D9D9"/>
-              <w:insideH w:val="single" w:sz="4" w:space="0" w:color="D9D9D9"/>
-              <w:insideV w:val="single" w:sz="4" w:space="0" w:color="D9D9D9"/>
+              <w:top w:val="single" w:sz="4" w:space="0" w:color="000000"/>
+              <w:left w:val="single" w:sz="4" w:space="0" w:color="000000"/>
+              <w:bottom w:val="single" w:sz="4" w:space="0" w:color="000000"/>
+              <w:right w:val="single" w:sz="4" w:space="0" w:color="000000"/>
+              <w:insideH w:val="single" w:sz="4" w:space="0" w:color="000000"/>
+              <w:insideV w:val="single" w:sz="4" w:space="0" w:color="000000"/>
             </w:tcBorders>
             <w:tcMar>
               <w:top w:w="80" w:type="dxa"/>
@@ -1820,24 +642,25 @@
           <w:p>
             <w:r>
               <w:rPr>
-                <w:rFonts w:ascii="Arial" w:hAnsi="Arial"/>
-                <w:color w:val="222222"/>
-                <w:sz w:val="18"/>
+                <w:rFonts w:ascii="Arial" w:hAnsi="Arial" w:eastAsia="Arial"/>
+                <w:color w:val="000000"/>
+                <w:sz w:val="22"/>
               </w:rPr>
-              <w:t>Construcción del MVP, módulos y pruebas iniciales.</w:t>
+              <w:t>Semana 13 en Anexo 4 Nivel 2</w:t>
             </w:r>
           </w:p>
         </w:tc>
         <w:tc>
           <w:tcPr>
             <w:tcW w:type="dxa" w:w="2880"/>
+            <w:shd w:fill="FFFFFF"/>
             <w:tcBorders>
-              <w:top w:val="single" w:sz="4" w:space="0" w:color="D9D9D9"/>
-              <w:left w:val="single" w:sz="4" w:space="0" w:color="D9D9D9"/>
-              <w:bottom w:val="single" w:sz="4" w:space="0" w:color="D9D9D9"/>
-              <w:right w:val="single" w:sz="4" w:space="0" w:color="D9D9D9"/>
-              <w:insideH w:val="single" w:sz="4" w:space="0" w:color="D9D9D9"/>
-              <w:insideV w:val="single" w:sz="4" w:space="0" w:color="D9D9D9"/>
+              <w:top w:val="single" w:sz="4" w:space="0" w:color="000000"/>
+              <w:left w:val="single" w:sz="4" w:space="0" w:color="000000"/>
+              <w:bottom w:val="single" w:sz="4" w:space="0" w:color="000000"/>
+              <w:right w:val="single" w:sz="4" w:space="0" w:color="000000"/>
+              <w:insideH w:val="single" w:sz="4" w:space="0" w:color="000000"/>
+              <w:insideV w:val="single" w:sz="4" w:space="0" w:color="000000"/>
             </w:tcBorders>
             <w:tcMar>
               <w:top w:w="80" w:type="dxa"/>
@@ -1850,27 +673,167 @@
           <w:p>
             <w:r>
               <w:rPr>
-                <w:rFonts w:ascii="Arial" w:hAnsi="Arial"/>
-                <w:color w:val="222222"/>
-                <w:sz w:val="18"/>
+                <w:rFonts w:ascii="Arial" w:hAnsi="Arial" w:eastAsia="Arial"/>
+                <w:color w:val="000000"/>
+                <w:sz w:val="22"/>
               </w:rPr>
-              <w:t>Aplicación funcional y matriz de pruebas.</w:t>
+              <w:t>Proyecto concluido, informe, componentes, recursos y sustentación.</w:t>
+            </w:r>
+          </w:p>
+        </w:tc>
+      </w:tr>
+    </w:tbl>
+    <w:p/>
+    <w:p>
+      <w:pPr>
+        <w:pStyle w:val="Heading1"/>
+        <w:keepNext/>
+        <w:keepLines/>
+      </w:pPr>
+      <w:r>
+        <w:rPr>
+          <w:rFonts w:ascii="Arial" w:hAnsi="Arial" w:eastAsia="Arial"/>
+          <w:color w:val="000000"/>
+          <w:sz w:val="22"/>
+        </w:rPr>
+        <w:t>3. Gantt resumido</w:t>
+      </w:r>
+    </w:p>
+    <w:tbl>
+      <w:tblPr>
+        <w:tblStyle w:val="TableGrid"/>
+        <w:tblW w:type="auto" w:w="0"/>
+        <w:jc w:val="center"/>
+        <w:tblLook w:firstColumn="1" w:firstRow="1" w:lastColumn="0" w:lastRow="0" w:noHBand="0" w:noVBand="1" w:val="04A0"/>
+      </w:tblPr>
+      <w:tblGrid>
+        <w:gridCol w:w="2880"/>
+        <w:gridCol w:w="2880"/>
+        <w:gridCol w:w="2880"/>
+      </w:tblGrid>
+      <w:tr>
+        <w:trPr>
+          <w:cantSplit/>
+          <w:tblHeader w:val="true"/>
+        </w:trPr>
+        <w:tc>
+          <w:tcPr>
+            <w:tcW w:type="dxa" w:w="2880"/>
+            <w:shd w:fill="000000"/>
+            <w:tcBorders>
+              <w:top w:val="single" w:sz="4" w:space="0" w:color="000000"/>
+              <w:left w:val="single" w:sz="4" w:space="0" w:color="000000"/>
+              <w:bottom w:val="single" w:sz="4" w:space="0" w:color="000000"/>
+              <w:right w:val="single" w:sz="4" w:space="0" w:color="000000"/>
+              <w:insideH w:val="single" w:sz="4" w:space="0" w:color="000000"/>
+              <w:insideV w:val="single" w:sz="4" w:space="0" w:color="000000"/>
+            </w:tcBorders>
+            <w:tcMar>
+              <w:top w:w="80" w:type="dxa"/>
+              <w:start w:w="100" w:type="dxa"/>
+              <w:bottom w:w="80" w:type="dxa"/>
+              <w:end w:w="100" w:type="dxa"/>
+            </w:tcMar>
+          </w:tcPr>
+          <w:p>
+            <w:pPr>
+              <w:keepNext/>
+            </w:pPr>
+            <w:r>
+              <w:rPr>
+                <w:rFonts w:ascii="Arial" w:hAnsi="Arial" w:eastAsia="Arial"/>
+                <w:b/>
+                <w:color w:val="FFFFFF"/>
+                <w:sz w:val="22"/>
+              </w:rPr>
+              <w:t>Semana</w:t>
+            </w:r>
+          </w:p>
+        </w:tc>
+        <w:tc>
+          <w:tcPr>
+            <w:tcW w:type="dxa" w:w="2880"/>
+            <w:shd w:fill="000000"/>
+            <w:tcBorders>
+              <w:top w:val="single" w:sz="4" w:space="0" w:color="000000"/>
+              <w:left w:val="single" w:sz="4" w:space="0" w:color="000000"/>
+              <w:bottom w:val="single" w:sz="4" w:space="0" w:color="000000"/>
+              <w:right w:val="single" w:sz="4" w:space="0" w:color="000000"/>
+              <w:insideH w:val="single" w:sz="4" w:space="0" w:color="000000"/>
+              <w:insideV w:val="single" w:sz="4" w:space="0" w:color="000000"/>
+            </w:tcBorders>
+            <w:tcMar>
+              <w:top w:w="80" w:type="dxa"/>
+              <w:start w:w="100" w:type="dxa"/>
+              <w:bottom w:w="80" w:type="dxa"/>
+              <w:end w:w="100" w:type="dxa"/>
+            </w:tcMar>
+          </w:tcPr>
+          <w:p>
+            <w:pPr>
+              <w:keepNext/>
+            </w:pPr>
+            <w:r>
+              <w:rPr>
+                <w:rFonts w:ascii="Arial" w:hAnsi="Arial" w:eastAsia="Arial"/>
+                <w:b/>
+                <w:color w:val="FFFFFF"/>
+                <w:sz w:val="22"/>
+              </w:rPr>
+              <w:t>Tareas y subtareas</w:t>
+            </w:r>
+          </w:p>
+        </w:tc>
+        <w:tc>
+          <w:tcPr>
+            <w:tcW w:type="dxa" w:w="2880"/>
+            <w:shd w:fill="000000"/>
+            <w:tcBorders>
+              <w:top w:val="single" w:sz="4" w:space="0" w:color="000000"/>
+              <w:left w:val="single" w:sz="4" w:space="0" w:color="000000"/>
+              <w:bottom w:val="single" w:sz="4" w:space="0" w:color="000000"/>
+              <w:right w:val="single" w:sz="4" w:space="0" w:color="000000"/>
+              <w:insideH w:val="single" w:sz="4" w:space="0" w:color="000000"/>
+              <w:insideV w:val="single" w:sz="4" w:space="0" w:color="000000"/>
+            </w:tcBorders>
+            <w:tcMar>
+              <w:top w:w="80" w:type="dxa"/>
+              <w:start w:w="100" w:type="dxa"/>
+              <w:bottom w:w="80" w:type="dxa"/>
+              <w:end w:w="100" w:type="dxa"/>
+            </w:tcMar>
+          </w:tcPr>
+          <w:p>
+            <w:pPr>
+              <w:keepNext/>
+            </w:pPr>
+            <w:r>
+              <w:rPr>
+                <w:rFonts w:ascii="Arial" w:hAnsi="Arial" w:eastAsia="Arial"/>
+                <w:b/>
+                <w:color w:val="FFFFFF"/>
+                <w:sz w:val="22"/>
+              </w:rPr>
+              <w:t>Hito / evidencia</w:t>
             </w:r>
           </w:p>
         </w:tc>
       </w:tr>
       <w:tr>
+        <w:trPr>
+          <w:cantSplit/>
+        </w:trPr>
         <w:tc>
           <w:tcPr>
             <w:tcW w:type="dxa" w:w="2880"/>
-            <w:shd w:fill="F7F9FB"/>
+            <w:shd w:fill="FFFFFF"/>
             <w:tcBorders>
-              <w:top w:val="single" w:sz="4" w:space="0" w:color="D9D9D9"/>
-              <w:left w:val="single" w:sz="4" w:space="0" w:color="D9D9D9"/>
-              <w:bottom w:val="single" w:sz="4" w:space="0" w:color="D9D9D9"/>
-              <w:right w:val="single" w:sz="4" w:space="0" w:color="D9D9D9"/>
-              <w:insideH w:val="single" w:sz="4" w:space="0" w:color="D9D9D9"/>
-              <w:insideV w:val="single" w:sz="4" w:space="0" w:color="D9D9D9"/>
+              <w:top w:val="single" w:sz="4" w:space="0" w:color="000000"/>
+              <w:left w:val="single" w:sz="4" w:space="0" w:color="000000"/>
+              <w:bottom w:val="single" w:sz="4" w:space="0" w:color="000000"/>
+              <w:right w:val="single" w:sz="4" w:space="0" w:color="000000"/>
+              <w:insideH w:val="single" w:sz="4" w:space="0" w:color="000000"/>
+              <w:insideV w:val="single" w:sz="4" w:space="0" w:color="000000"/>
             </w:tcBorders>
             <w:tcMar>
               <w:top w:w="80" w:type="dxa"/>
@@ -1883,25 +846,25 @@
           <w:p>
             <w:r>
               <w:rPr>
-                <w:rFonts w:ascii="Arial" w:hAnsi="Arial"/>
-                <w:color w:val="222222"/>
-                <w:sz w:val="18"/>
+                <w:rFonts w:ascii="Arial" w:hAnsi="Arial" w:eastAsia="Arial"/>
+                <w:color w:val="000000"/>
+                <w:sz w:val="22"/>
               </w:rPr>
-              <w:t>10</w:t>
+              <w:t>1</w:t>
             </w:r>
           </w:p>
         </w:tc>
         <w:tc>
           <w:tcPr>
             <w:tcW w:type="dxa" w:w="2880"/>
-            <w:shd w:fill="F7F9FB"/>
+            <w:shd w:fill="FFFFFF"/>
             <w:tcBorders>
-              <w:top w:val="single" w:sz="4" w:space="0" w:color="D9D9D9"/>
-              <w:left w:val="single" w:sz="4" w:space="0" w:color="D9D9D9"/>
-              <w:bottom w:val="single" w:sz="4" w:space="0" w:color="D9D9D9"/>
-              <w:right w:val="single" w:sz="4" w:space="0" w:color="D9D9D9"/>
-              <w:insideH w:val="single" w:sz="4" w:space="0" w:color="D9D9D9"/>
-              <w:insideV w:val="single" w:sz="4" w:space="0" w:color="D9D9D9"/>
+              <w:top w:val="single" w:sz="4" w:space="0" w:color="000000"/>
+              <w:left w:val="single" w:sz="4" w:space="0" w:color="000000"/>
+              <w:bottom w:val="single" w:sz="4" w:space="0" w:color="000000"/>
+              <w:right w:val="single" w:sz="4" w:space="0" w:color="000000"/>
+              <w:insideH w:val="single" w:sz="4" w:space="0" w:color="000000"/>
+              <w:insideV w:val="single" w:sz="4" w:space="0" w:color="000000"/>
             </w:tcBorders>
             <w:tcMar>
               <w:top w:w="80" w:type="dxa"/>
@@ -1914,25 +877,25 @@
           <w:p>
             <w:r>
               <w:rPr>
-                <w:rFonts w:ascii="Arial" w:hAnsi="Arial"/>
-                <w:color w:val="222222"/>
-                <w:sz w:val="18"/>
+                <w:rFonts w:ascii="Arial" w:hAnsi="Arial" w:eastAsia="Arial"/>
+                <w:color w:val="000000"/>
+                <w:sz w:val="22"/>
               </w:rPr>
-              <w:t>Presentación del avance mínimo 50%.</w:t>
+              <w:t>Formar el grupo; seleccionar el problema; identificar los perfiles de usuario.</w:t>
             </w:r>
           </w:p>
         </w:tc>
         <w:tc>
           <w:tcPr>
             <w:tcW w:type="dxa" w:w="2880"/>
-            <w:shd w:fill="F7F9FB"/>
+            <w:shd w:fill="FFFFFF"/>
             <w:tcBorders>
-              <w:top w:val="single" w:sz="4" w:space="0" w:color="D9D9D9"/>
-              <w:left w:val="single" w:sz="4" w:space="0" w:color="D9D9D9"/>
-              <w:bottom w:val="single" w:sz="4" w:space="0" w:color="D9D9D9"/>
-              <w:right w:val="single" w:sz="4" w:space="0" w:color="D9D9D9"/>
-              <w:insideH w:val="single" w:sz="4" w:space="0" w:color="D9D9D9"/>
-              <w:insideV w:val="single" w:sz="4" w:space="0" w:color="D9D9D9"/>
+              <w:top w:val="single" w:sz="4" w:space="0" w:color="000000"/>
+              <w:left w:val="single" w:sz="4" w:space="0" w:color="000000"/>
+              <w:bottom w:val="single" w:sz="4" w:space="0" w:color="000000"/>
+              <w:right w:val="single" w:sz="4" w:space="0" w:color="000000"/>
+              <w:insideH w:val="single" w:sz="4" w:space="0" w:color="000000"/>
+              <w:insideV w:val="single" w:sz="4" w:space="0" w:color="000000"/>
             </w:tcBorders>
             <w:tcMar>
               <w:top w:w="80" w:type="dxa"/>
@@ -1945,26 +908,30 @@
           <w:p>
             <w:r>
               <w:rPr>
-                <w:rFonts w:ascii="Arial" w:hAnsi="Arial"/>
-                <w:color w:val="222222"/>
-                <w:sz w:val="18"/>
+                <w:rFonts w:ascii="Arial" w:hAnsi="Arial" w:eastAsia="Arial"/>
+                <w:color w:val="000000"/>
+                <w:sz w:val="22"/>
               </w:rPr>
-              <w:t>Entregable 2 en Word y defensa.</w:t>
+              <w:t>Grupo y tema acordados.</w:t>
             </w:r>
           </w:p>
         </w:tc>
       </w:tr>
       <w:tr>
+        <w:trPr>
+          <w:cantSplit/>
+        </w:trPr>
         <w:tc>
           <w:tcPr>
             <w:tcW w:type="dxa" w:w="2880"/>
+            <w:shd w:fill="FFFFFF"/>
             <w:tcBorders>
-              <w:top w:val="single" w:sz="4" w:space="0" w:color="D9D9D9"/>
-              <w:left w:val="single" w:sz="4" w:space="0" w:color="D9D9D9"/>
-              <w:bottom w:val="single" w:sz="4" w:space="0" w:color="D9D9D9"/>
-              <w:right w:val="single" w:sz="4" w:space="0" w:color="D9D9D9"/>
-              <w:insideH w:val="single" w:sz="4" w:space="0" w:color="D9D9D9"/>
-              <w:insideV w:val="single" w:sz="4" w:space="0" w:color="D9D9D9"/>
+              <w:top w:val="single" w:sz="4" w:space="0" w:color="000000"/>
+              <w:left w:val="single" w:sz="4" w:space="0" w:color="000000"/>
+              <w:bottom w:val="single" w:sz="4" w:space="0" w:color="000000"/>
+              <w:right w:val="single" w:sz="4" w:space="0" w:color="000000"/>
+              <w:insideH w:val="single" w:sz="4" w:space="0" w:color="000000"/>
+              <w:insideV w:val="single" w:sz="4" w:space="0" w:color="000000"/>
             </w:tcBorders>
             <w:tcMar>
               <w:top w:w="80" w:type="dxa"/>
@@ -1977,24 +944,25 @@
           <w:p>
             <w:r>
               <w:rPr>
-                <w:rFonts w:ascii="Arial" w:hAnsi="Arial"/>
-                <w:color w:val="222222"/>
-                <w:sz w:val="18"/>
+                <w:rFonts w:ascii="Arial" w:hAnsi="Arial" w:eastAsia="Arial"/>
+                <w:color w:val="000000"/>
+                <w:sz w:val="22"/>
               </w:rPr>
-              <w:t>11–12</w:t>
+              <w:t>2–3</w:t>
             </w:r>
           </w:p>
         </w:tc>
         <w:tc>
           <w:tcPr>
             <w:tcW w:type="dxa" w:w="2880"/>
+            <w:shd w:fill="FFFFFF"/>
             <w:tcBorders>
-              <w:top w:val="single" w:sz="4" w:space="0" w:color="D9D9D9"/>
-              <w:left w:val="single" w:sz="4" w:space="0" w:color="D9D9D9"/>
-              <w:bottom w:val="single" w:sz="4" w:space="0" w:color="D9D9D9"/>
-              <w:right w:val="single" w:sz="4" w:space="0" w:color="D9D9D9"/>
-              <w:insideH w:val="single" w:sz="4" w:space="0" w:color="D9D9D9"/>
-              <w:insideV w:val="single" w:sz="4" w:space="0" w:color="D9D9D9"/>
+              <w:top w:val="single" w:sz="4" w:space="0" w:color="000000"/>
+              <w:left w:val="single" w:sz="4" w:space="0" w:color="000000"/>
+              <w:bottom w:val="single" w:sz="4" w:space="0" w:color="000000"/>
+              <w:right w:val="single" w:sz="4" w:space="0" w:color="000000"/>
+              <w:insideH w:val="single" w:sz="4" w:space="0" w:color="000000"/>
+              <w:insideV w:val="single" w:sz="4" w:space="0" w:color="000000"/>
             </w:tcBorders>
             <w:tcMar>
               <w:top w:w="80" w:type="dxa"/>
@@ -2007,24 +975,25 @@
           <w:p>
             <w:r>
               <w:rPr>
-                <w:rFonts w:ascii="Arial" w:hAnsi="Arial"/>
-                <w:color w:val="222222"/>
-                <w:sz w:val="18"/>
+                <w:rFonts w:ascii="Arial" w:hAnsi="Arial" w:eastAsia="Arial"/>
+                <w:color w:val="000000"/>
+                <w:sz w:val="22"/>
               </w:rPr>
-              <w:t>Integración, documentación, validación y correcciones.</w:t>
+              <w:t>Buscar fuentes; elaborar SEPTE; redactar objetivos SMART; justificar la propuesta y delimitar alcance.</w:t>
             </w:r>
           </w:p>
         </w:tc>
         <w:tc>
           <w:tcPr>
             <w:tcW w:type="dxa" w:w="2880"/>
+            <w:shd w:fill="FFFFFF"/>
             <w:tcBorders>
-              <w:top w:val="single" w:sz="4" w:space="0" w:color="D9D9D9"/>
-              <w:left w:val="single" w:sz="4" w:space="0" w:color="D9D9D9"/>
-              <w:bottom w:val="single" w:sz="4" w:space="0" w:color="D9D9D9"/>
-              <w:right w:val="single" w:sz="4" w:space="0" w:color="D9D9D9"/>
-              <w:insideH w:val="single" w:sz="4" w:space="0" w:color="D9D9D9"/>
-              <w:insideV w:val="single" w:sz="4" w:space="0" w:color="D9D9D9"/>
+              <w:top w:val="single" w:sz="4" w:space="0" w:color="000000"/>
+              <w:left w:val="single" w:sz="4" w:space="0" w:color="000000"/>
+              <w:bottom w:val="single" w:sz="4" w:space="0" w:color="000000"/>
+              <w:right w:val="single" w:sz="4" w:space="0" w:color="000000"/>
+              <w:insideH w:val="single" w:sz="4" w:space="0" w:color="000000"/>
+              <w:insideV w:val="single" w:sz="4" w:space="0" w:color="000000"/>
             </w:tcBorders>
             <w:tcMar>
               <w:top w:w="80" w:type="dxa"/>
@@ -2037,27 +1006,30 @@
           <w:p>
             <w:r>
               <w:rPr>
-                <w:rFonts w:ascii="Arial" w:hAnsi="Arial"/>
-                <w:color w:val="222222"/>
-                <w:sz w:val="18"/>
+                <w:rFonts w:ascii="Arial" w:hAnsi="Arial" w:eastAsia="Arial"/>
+                <w:color w:val="000000"/>
+                <w:sz w:val="22"/>
               </w:rPr>
-              <w:t>Manuales y recursos.</w:t>
+              <w:t>Entregable 1 en Word.</w:t>
             </w:r>
           </w:p>
         </w:tc>
       </w:tr>
       <w:tr>
+        <w:trPr>
+          <w:cantSplit/>
+        </w:trPr>
         <w:tc>
           <w:tcPr>
             <w:tcW w:type="dxa" w:w="2880"/>
-            <w:shd w:fill="F7F9FB"/>
+            <w:shd w:fill="FFFFFF"/>
             <w:tcBorders>
-              <w:top w:val="single" w:sz="4" w:space="0" w:color="D9D9D9"/>
-              <w:left w:val="single" w:sz="4" w:space="0" w:color="D9D9D9"/>
-              <w:bottom w:val="single" w:sz="4" w:space="0" w:color="D9D9D9"/>
-              <w:right w:val="single" w:sz="4" w:space="0" w:color="D9D9D9"/>
-              <w:insideH w:val="single" w:sz="4" w:space="0" w:color="D9D9D9"/>
-              <w:insideV w:val="single" w:sz="4" w:space="0" w:color="D9D9D9"/>
+              <w:top w:val="single" w:sz="4" w:space="0" w:color="000000"/>
+              <w:left w:val="single" w:sz="4" w:space="0" w:color="000000"/>
+              <w:bottom w:val="single" w:sz="4" w:space="0" w:color="000000"/>
+              <w:right w:val="single" w:sz="4" w:space="0" w:color="000000"/>
+              <w:insideH w:val="single" w:sz="4" w:space="0" w:color="000000"/>
+              <w:insideV w:val="single" w:sz="4" w:space="0" w:color="000000"/>
             </w:tcBorders>
             <w:tcMar>
               <w:top w:w="80" w:type="dxa"/>
@@ -2070,25 +1042,25 @@
           <w:p>
             <w:r>
               <w:rPr>
-                <w:rFonts w:ascii="Arial" w:hAnsi="Arial"/>
-                <w:color w:val="222222"/>
-                <w:sz w:val="18"/>
+                <w:rFonts w:ascii="Arial" w:hAnsi="Arial" w:eastAsia="Arial"/>
+                <w:color w:val="000000"/>
+                <w:sz w:val="22"/>
               </w:rPr>
-              <w:t>13</w:t>
+              <w:t>4</w:t>
             </w:r>
           </w:p>
         </w:tc>
         <w:tc>
           <w:tcPr>
             <w:tcW w:type="dxa" w:w="2880"/>
-            <w:shd w:fill="F7F9FB"/>
+            <w:shd w:fill="FFFFFF"/>
             <w:tcBorders>
-              <w:top w:val="single" w:sz="4" w:space="0" w:color="D9D9D9"/>
-              <w:left w:val="single" w:sz="4" w:space="0" w:color="D9D9D9"/>
-              <w:bottom w:val="single" w:sz="4" w:space="0" w:color="D9D9D9"/>
-              <w:right w:val="single" w:sz="4" w:space="0" w:color="D9D9D9"/>
-              <w:insideH w:val="single" w:sz="4" w:space="0" w:color="D9D9D9"/>
-              <w:insideV w:val="single" w:sz="4" w:space="0" w:color="D9D9D9"/>
+              <w:top w:val="single" w:sz="4" w:space="0" w:color="000000"/>
+              <w:left w:val="single" w:sz="4" w:space="0" w:color="000000"/>
+              <w:bottom w:val="single" w:sz="4" w:space="0" w:color="000000"/>
+              <w:right w:val="single" w:sz="4" w:space="0" w:color="000000"/>
+              <w:insideH w:val="single" w:sz="4" w:space="0" w:color="000000"/>
+              <w:insideV w:val="single" w:sz="4" w:space="0" w:color="000000"/>
             </w:tcBorders>
             <w:tcMar>
               <w:top w:w="80" w:type="dxa"/>
@@ -2101,25 +1073,25 @@
           <w:p>
             <w:r>
               <w:rPr>
-                <w:rFonts w:ascii="Arial" w:hAnsi="Arial"/>
-                <w:color w:val="222222"/>
-                <w:sz w:val="18"/>
+                <w:rFonts w:ascii="Arial" w:hAnsi="Arial" w:eastAsia="Arial"/>
+                <w:color w:val="000000"/>
+                <w:sz w:val="22"/>
               </w:rPr>
-              <w:t>Entrega del proyecto al 100% y defensa.</w:t>
+              <w:t>Priorizar historias; definir criterios; diseñar arquitectura y entidades SQL.</w:t>
             </w:r>
           </w:p>
         </w:tc>
         <w:tc>
           <w:tcPr>
             <w:tcW w:type="dxa" w:w="2880"/>
-            <w:shd w:fill="F7F9FB"/>
+            <w:shd w:fill="FFFFFF"/>
             <w:tcBorders>
-              <w:top w:val="single" w:sz="4" w:space="0" w:color="D9D9D9"/>
-              <w:left w:val="single" w:sz="4" w:space="0" w:color="D9D9D9"/>
-              <w:bottom w:val="single" w:sz="4" w:space="0" w:color="D9D9D9"/>
-              <w:right w:val="single" w:sz="4" w:space="0" w:color="D9D9D9"/>
-              <w:insideH w:val="single" w:sz="4" w:space="0" w:color="D9D9D9"/>
-              <w:insideV w:val="single" w:sz="4" w:space="0" w:color="D9D9D9"/>
+              <w:top w:val="single" w:sz="4" w:space="0" w:color="000000"/>
+              <w:left w:val="single" w:sz="4" w:space="0" w:color="000000"/>
+              <w:bottom w:val="single" w:sz="4" w:space="0" w:color="000000"/>
+              <w:right w:val="single" w:sz="4" w:space="0" w:color="000000"/>
+              <w:insideH w:val="single" w:sz="4" w:space="0" w:color="000000"/>
+              <w:insideV w:val="single" w:sz="4" w:space="0" w:color="000000"/>
             </w:tcBorders>
             <w:tcMar>
               <w:top w:w="80" w:type="dxa"/>
@@ -2132,11 +1104,599 @@
           <w:p>
             <w:r>
               <w:rPr>
-                <w:rFonts w:ascii="Arial" w:hAnsi="Arial"/>
-                <w:color w:val="222222"/>
-                <w:sz w:val="18"/>
+                <w:rFonts w:ascii="Arial" w:hAnsi="Arial" w:eastAsia="Arial"/>
+                <w:color w:val="000000"/>
+                <w:sz w:val="22"/>
               </w:rPr>
-              <w:t>Informe final en Word y sustentación.</w:t>
+              <w:t>Backlog y diagramas.</w:t>
+            </w:r>
+          </w:p>
+        </w:tc>
+      </w:tr>
+      <w:tr>
+        <w:trPr>
+          <w:cantSplit/>
+        </w:trPr>
+        <w:tc>
+          <w:tcPr>
+            <w:tcW w:type="dxa" w:w="2880"/>
+            <w:shd w:fill="FFFFFF"/>
+            <w:tcBorders>
+              <w:top w:val="single" w:sz="4" w:space="0" w:color="000000"/>
+              <w:left w:val="single" w:sz="4" w:space="0" w:color="000000"/>
+              <w:bottom w:val="single" w:sz="4" w:space="0" w:color="000000"/>
+              <w:right w:val="single" w:sz="4" w:space="0" w:color="000000"/>
+              <w:insideH w:val="single" w:sz="4" w:space="0" w:color="000000"/>
+              <w:insideV w:val="single" w:sz="4" w:space="0" w:color="000000"/>
+            </w:tcBorders>
+            <w:tcMar>
+              <w:top w:w="80" w:type="dxa"/>
+              <w:start w:w="100" w:type="dxa"/>
+              <w:bottom w:w="80" w:type="dxa"/>
+              <w:end w:w="100" w:type="dxa"/>
+            </w:tcMar>
+            <w:vAlign w:val="center"/>
+          </w:tcPr>
+          <w:p>
+            <w:r>
+              <w:rPr>
+                <w:rFonts w:ascii="Arial" w:hAnsi="Arial" w:eastAsia="Arial"/>
+                <w:color w:val="000000"/>
+                <w:sz w:val="22"/>
+              </w:rPr>
+              <w:t>5–6</w:t>
+            </w:r>
+          </w:p>
+        </w:tc>
+        <w:tc>
+          <w:tcPr>
+            <w:tcW w:type="dxa" w:w="2880"/>
+            <w:shd w:fill="FFFFFF"/>
+            <w:tcBorders>
+              <w:top w:val="single" w:sz="4" w:space="0" w:color="000000"/>
+              <w:left w:val="single" w:sz="4" w:space="0" w:color="000000"/>
+              <w:bottom w:val="single" w:sz="4" w:space="0" w:color="000000"/>
+              <w:right w:val="single" w:sz="4" w:space="0" w:color="000000"/>
+              <w:insideH w:val="single" w:sz="4" w:space="0" w:color="000000"/>
+              <w:insideV w:val="single" w:sz="4" w:space="0" w:color="000000"/>
+            </w:tcBorders>
+            <w:tcMar>
+              <w:top w:w="80" w:type="dxa"/>
+              <w:start w:w="100" w:type="dxa"/>
+              <w:bottom w:w="80" w:type="dxa"/>
+              <w:end w:w="100" w:type="dxa"/>
+            </w:tcMar>
+            <w:vAlign w:val="center"/>
+          </w:tcPr>
+          <w:p>
+            <w:r>
+              <w:rPr>
+                <w:rFonts w:ascii="Arial" w:hAnsi="Arial" w:eastAsia="Arial"/>
+                <w:color w:val="000000"/>
+                <w:sz w:val="22"/>
+              </w:rPr>
+              <w:t>Construir interfaz base; catálogo; filtros; datos demo; esquema y carga SQL.</w:t>
+            </w:r>
+          </w:p>
+        </w:tc>
+        <w:tc>
+          <w:tcPr>
+            <w:tcW w:type="dxa" w:w="2880"/>
+            <w:shd w:fill="FFFFFF"/>
+            <w:tcBorders>
+              <w:top w:val="single" w:sz="4" w:space="0" w:color="000000"/>
+              <w:left w:val="single" w:sz="4" w:space="0" w:color="000000"/>
+              <w:bottom w:val="single" w:sz="4" w:space="0" w:color="000000"/>
+              <w:right w:val="single" w:sz="4" w:space="0" w:color="000000"/>
+              <w:insideH w:val="single" w:sz="4" w:space="0" w:color="000000"/>
+              <w:insideV w:val="single" w:sz="4" w:space="0" w:color="000000"/>
+            </w:tcBorders>
+            <w:tcMar>
+              <w:top w:w="80" w:type="dxa"/>
+              <w:start w:w="100" w:type="dxa"/>
+              <w:bottom w:w="80" w:type="dxa"/>
+              <w:end w:w="100" w:type="dxa"/>
+            </w:tcMar>
+            <w:vAlign w:val="center"/>
+          </w:tcPr>
+          <w:p>
+            <w:r>
+              <w:rPr>
+                <w:rFonts w:ascii="Arial" w:hAnsi="Arial" w:eastAsia="Arial"/>
+                <w:color w:val="000000"/>
+                <w:sz w:val="22"/>
+              </w:rPr>
+              <w:t>Prototipo base ejecutable.</w:t>
+            </w:r>
+          </w:p>
+        </w:tc>
+      </w:tr>
+      <w:tr>
+        <w:trPr>
+          <w:cantSplit/>
+        </w:trPr>
+        <w:tc>
+          <w:tcPr>
+            <w:tcW w:type="dxa" w:w="2880"/>
+            <w:shd w:fill="FFFFFF"/>
+            <w:tcBorders>
+              <w:top w:val="single" w:sz="4" w:space="0" w:color="000000"/>
+              <w:left w:val="single" w:sz="4" w:space="0" w:color="000000"/>
+              <w:bottom w:val="single" w:sz="4" w:space="0" w:color="000000"/>
+              <w:right w:val="single" w:sz="4" w:space="0" w:color="000000"/>
+              <w:insideH w:val="single" w:sz="4" w:space="0" w:color="000000"/>
+              <w:insideV w:val="single" w:sz="4" w:space="0" w:color="000000"/>
+            </w:tcBorders>
+            <w:tcMar>
+              <w:top w:w="80" w:type="dxa"/>
+              <w:start w:w="100" w:type="dxa"/>
+              <w:bottom w:w="80" w:type="dxa"/>
+              <w:end w:w="100" w:type="dxa"/>
+            </w:tcMar>
+            <w:vAlign w:val="center"/>
+          </w:tcPr>
+          <w:p>
+            <w:r>
+              <w:rPr>
+                <w:rFonts w:ascii="Arial" w:hAnsi="Arial" w:eastAsia="Arial"/>
+                <w:color w:val="000000"/>
+                <w:sz w:val="22"/>
+              </w:rPr>
+              <w:t>7–8</w:t>
+            </w:r>
+          </w:p>
+        </w:tc>
+        <w:tc>
+          <w:tcPr>
+            <w:tcW w:type="dxa" w:w="2880"/>
+            <w:shd w:fill="FFFFFF"/>
+            <w:tcBorders>
+              <w:top w:val="single" w:sz="4" w:space="0" w:color="000000"/>
+              <w:left w:val="single" w:sz="4" w:space="0" w:color="000000"/>
+              <w:bottom w:val="single" w:sz="4" w:space="0" w:color="000000"/>
+              <w:right w:val="single" w:sz="4" w:space="0" w:color="000000"/>
+              <w:insideH w:val="single" w:sz="4" w:space="0" w:color="000000"/>
+              <w:insideV w:val="single" w:sz="4" w:space="0" w:color="000000"/>
+            </w:tcBorders>
+            <w:tcMar>
+              <w:top w:w="80" w:type="dxa"/>
+              <w:start w:w="100" w:type="dxa"/>
+              <w:bottom w:w="80" w:type="dxa"/>
+              <w:end w:w="100" w:type="dxa"/>
+            </w:tcMar>
+            <w:vAlign w:val="center"/>
+          </w:tcPr>
+          <w:p>
+            <w:r>
+              <w:rPr>
+                <w:rFonts w:ascii="Arial" w:hAnsi="Arial" w:eastAsia="Arial"/>
+                <w:color w:val="000000"/>
+                <w:sz w:val="22"/>
+              </w:rPr>
+              <w:t>Completar carrito y venta; validar cantidades; descontar stock; implementar reportes.</w:t>
+            </w:r>
+          </w:p>
+        </w:tc>
+        <w:tc>
+          <w:tcPr>
+            <w:tcW w:type="dxa" w:w="2880"/>
+            <w:shd w:fill="FFFFFF"/>
+            <w:tcBorders>
+              <w:top w:val="single" w:sz="4" w:space="0" w:color="000000"/>
+              <w:left w:val="single" w:sz="4" w:space="0" w:color="000000"/>
+              <w:bottom w:val="single" w:sz="4" w:space="0" w:color="000000"/>
+              <w:right w:val="single" w:sz="4" w:space="0" w:color="000000"/>
+              <w:insideH w:val="single" w:sz="4" w:space="0" w:color="000000"/>
+              <w:insideV w:val="single" w:sz="4" w:space="0" w:color="000000"/>
+            </w:tcBorders>
+            <w:tcMar>
+              <w:top w:w="80" w:type="dxa"/>
+              <w:start w:w="100" w:type="dxa"/>
+              <w:bottom w:w="80" w:type="dxa"/>
+              <w:end w:w="100" w:type="dxa"/>
+            </w:tcMar>
+            <w:vAlign w:val="center"/>
+          </w:tcPr>
+          <w:p>
+            <w:r>
+              <w:rPr>
+                <w:rFonts w:ascii="Arial" w:hAnsi="Arial" w:eastAsia="Arial"/>
+                <w:color w:val="000000"/>
+                <w:sz w:val="22"/>
+              </w:rPr>
+              <w:t>Flujo venta e inventario.</w:t>
+            </w:r>
+          </w:p>
+        </w:tc>
+      </w:tr>
+      <w:tr>
+        <w:trPr>
+          <w:cantSplit/>
+        </w:trPr>
+        <w:tc>
+          <w:tcPr>
+            <w:tcW w:type="dxa" w:w="2880"/>
+            <w:shd w:fill="FFFFFF"/>
+            <w:tcBorders>
+              <w:top w:val="single" w:sz="4" w:space="0" w:color="000000"/>
+              <w:left w:val="single" w:sz="4" w:space="0" w:color="000000"/>
+              <w:bottom w:val="single" w:sz="4" w:space="0" w:color="000000"/>
+              <w:right w:val="single" w:sz="4" w:space="0" w:color="000000"/>
+              <w:insideH w:val="single" w:sz="4" w:space="0" w:color="000000"/>
+              <w:insideV w:val="single" w:sz="4" w:space="0" w:color="000000"/>
+            </w:tcBorders>
+            <w:tcMar>
+              <w:top w:w="80" w:type="dxa"/>
+              <w:start w:w="100" w:type="dxa"/>
+              <w:bottom w:w="80" w:type="dxa"/>
+              <w:end w:w="100" w:type="dxa"/>
+            </w:tcMar>
+            <w:vAlign w:val="center"/>
+          </w:tcPr>
+          <w:p>
+            <w:r>
+              <w:rPr>
+                <w:rFonts w:ascii="Arial" w:hAnsi="Arial" w:eastAsia="Arial"/>
+                <w:color w:val="000000"/>
+                <w:sz w:val="22"/>
+              </w:rPr>
+              <w:t>9</w:t>
+            </w:r>
+          </w:p>
+        </w:tc>
+        <w:tc>
+          <w:tcPr>
+            <w:tcW w:type="dxa" w:w="2880"/>
+            <w:shd w:fill="FFFFFF"/>
+            <w:tcBorders>
+              <w:top w:val="single" w:sz="4" w:space="0" w:color="000000"/>
+              <w:left w:val="single" w:sz="4" w:space="0" w:color="000000"/>
+              <w:bottom w:val="single" w:sz="4" w:space="0" w:color="000000"/>
+              <w:right w:val="single" w:sz="4" w:space="0" w:color="000000"/>
+              <w:insideH w:val="single" w:sz="4" w:space="0" w:color="000000"/>
+              <w:insideV w:val="single" w:sz="4" w:space="0" w:color="000000"/>
+            </w:tcBorders>
+            <w:tcMar>
+              <w:top w:w="80" w:type="dxa"/>
+              <w:start w:w="100" w:type="dxa"/>
+              <w:bottom w:w="80" w:type="dxa"/>
+              <w:end w:w="100" w:type="dxa"/>
+            </w:tcMar>
+            <w:vAlign w:val="center"/>
+          </w:tcPr>
+          <w:p>
+            <w:r>
+              <w:rPr>
+                <w:rFonts w:ascii="Arial" w:hAnsi="Arial" w:eastAsia="Arial"/>
+                <w:color w:val="000000"/>
+                <w:sz w:val="22"/>
+              </w:rPr>
+              <w:t>Integrar módulos; corregir datos de demostración; compilar frontend y backend; ejecutar API de integración.</w:t>
+            </w:r>
+          </w:p>
+        </w:tc>
+        <w:tc>
+          <w:tcPr>
+            <w:tcW w:type="dxa" w:w="2880"/>
+            <w:shd w:fill="FFFFFF"/>
+            <w:tcBorders>
+              <w:top w:val="single" w:sz="4" w:space="0" w:color="000000"/>
+              <w:left w:val="single" w:sz="4" w:space="0" w:color="000000"/>
+              <w:bottom w:val="single" w:sz="4" w:space="0" w:color="000000"/>
+              <w:right w:val="single" w:sz="4" w:space="0" w:color="000000"/>
+              <w:insideH w:val="single" w:sz="4" w:space="0" w:color="000000"/>
+              <w:insideV w:val="single" w:sz="4" w:space="0" w:color="000000"/>
+            </w:tcBorders>
+            <w:tcMar>
+              <w:top w:w="80" w:type="dxa"/>
+              <w:start w:w="100" w:type="dxa"/>
+              <w:bottom w:w="80" w:type="dxa"/>
+              <w:end w:w="100" w:type="dxa"/>
+            </w:tcMar>
+            <w:vAlign w:val="center"/>
+          </w:tcPr>
+          <w:p>
+            <w:r>
+              <w:rPr>
+                <w:rFonts w:ascii="Arial" w:hAnsi="Arial" w:eastAsia="Arial"/>
+                <w:color w:val="000000"/>
+                <w:sz w:val="22"/>
+              </w:rPr>
+              <w:t>Registro de compilación e integración.</w:t>
+            </w:r>
+          </w:p>
+        </w:tc>
+      </w:tr>
+      <w:tr>
+        <w:trPr>
+          <w:cantSplit/>
+        </w:trPr>
+        <w:tc>
+          <w:tcPr>
+            <w:tcW w:type="dxa" w:w="2880"/>
+            <w:shd w:fill="FFFFFF"/>
+            <w:tcBorders>
+              <w:top w:val="single" w:sz="4" w:space="0" w:color="000000"/>
+              <w:left w:val="single" w:sz="4" w:space="0" w:color="000000"/>
+              <w:bottom w:val="single" w:sz="4" w:space="0" w:color="000000"/>
+              <w:right w:val="single" w:sz="4" w:space="0" w:color="000000"/>
+              <w:insideH w:val="single" w:sz="4" w:space="0" w:color="000000"/>
+              <w:insideV w:val="single" w:sz="4" w:space="0" w:color="000000"/>
+            </w:tcBorders>
+            <w:tcMar>
+              <w:top w:w="80" w:type="dxa"/>
+              <w:start w:w="100" w:type="dxa"/>
+              <w:bottom w:w="80" w:type="dxa"/>
+              <w:end w:w="100" w:type="dxa"/>
+            </w:tcMar>
+            <w:vAlign w:val="center"/>
+          </w:tcPr>
+          <w:p>
+            <w:r>
+              <w:rPr>
+                <w:rFonts w:ascii="Arial" w:hAnsi="Arial" w:eastAsia="Arial"/>
+                <w:color w:val="000000"/>
+                <w:sz w:val="22"/>
+              </w:rPr>
+              <w:t>10</w:t>
+            </w:r>
+          </w:p>
+        </w:tc>
+        <w:tc>
+          <w:tcPr>
+            <w:tcW w:type="dxa" w:w="2880"/>
+            <w:shd w:fill="FFFFFF"/>
+            <w:tcBorders>
+              <w:top w:val="single" w:sz="4" w:space="0" w:color="000000"/>
+              <w:left w:val="single" w:sz="4" w:space="0" w:color="000000"/>
+              <w:bottom w:val="single" w:sz="4" w:space="0" w:color="000000"/>
+              <w:right w:val="single" w:sz="4" w:space="0" w:color="000000"/>
+              <w:insideH w:val="single" w:sz="4" w:space="0" w:color="000000"/>
+              <w:insideV w:val="single" w:sz="4" w:space="0" w:color="000000"/>
+            </w:tcBorders>
+            <w:tcMar>
+              <w:top w:w="80" w:type="dxa"/>
+              <w:start w:w="100" w:type="dxa"/>
+              <w:bottom w:w="80" w:type="dxa"/>
+              <w:end w:w="100" w:type="dxa"/>
+            </w:tcMar>
+            <w:vAlign w:val="center"/>
+          </w:tcPr>
+          <w:p>
+            <w:r>
+              <w:rPr>
+                <w:rFonts w:ascii="Arial" w:hAnsi="Arial" w:eastAsia="Arial"/>
+                <w:color w:val="000000"/>
+                <w:sz w:val="22"/>
+              </w:rPr>
+              <w:t>Consolidar presentación de avance; explicar funcionalidades disponibles y pendientes.</w:t>
+            </w:r>
+          </w:p>
+        </w:tc>
+        <w:tc>
+          <w:tcPr>
+            <w:tcW w:type="dxa" w:w="2880"/>
+            <w:shd w:fill="FFFFFF"/>
+            <w:tcBorders>
+              <w:top w:val="single" w:sz="4" w:space="0" w:color="000000"/>
+              <w:left w:val="single" w:sz="4" w:space="0" w:color="000000"/>
+              <w:bottom w:val="single" w:sz="4" w:space="0" w:color="000000"/>
+              <w:right w:val="single" w:sz="4" w:space="0" w:color="000000"/>
+              <w:insideH w:val="single" w:sz="4" w:space="0" w:color="000000"/>
+              <w:insideV w:val="single" w:sz="4" w:space="0" w:color="000000"/>
+            </w:tcBorders>
+            <w:tcMar>
+              <w:top w:w="80" w:type="dxa"/>
+              <w:start w:w="100" w:type="dxa"/>
+              <w:bottom w:w="80" w:type="dxa"/>
+              <w:end w:w="100" w:type="dxa"/>
+            </w:tcMar>
+            <w:vAlign w:val="center"/>
+          </w:tcPr>
+          <w:p>
+            <w:r>
+              <w:rPr>
+                <w:rFonts w:ascii="Arial" w:hAnsi="Arial" w:eastAsia="Arial"/>
+                <w:color w:val="000000"/>
+                <w:sz w:val="22"/>
+              </w:rPr>
+              <w:t>Hito de avance según Anexo 4.</w:t>
+            </w:r>
+          </w:p>
+        </w:tc>
+      </w:tr>
+      <w:tr>
+        <w:trPr>
+          <w:cantSplit/>
+        </w:trPr>
+        <w:tc>
+          <w:tcPr>
+            <w:tcW w:type="dxa" w:w="2880"/>
+            <w:shd w:fill="FFFFFF"/>
+            <w:tcBorders>
+              <w:top w:val="single" w:sz="4" w:space="0" w:color="000000"/>
+              <w:left w:val="single" w:sz="4" w:space="0" w:color="000000"/>
+              <w:bottom w:val="single" w:sz="4" w:space="0" w:color="000000"/>
+              <w:right w:val="single" w:sz="4" w:space="0" w:color="000000"/>
+              <w:insideH w:val="single" w:sz="4" w:space="0" w:color="000000"/>
+              <w:insideV w:val="single" w:sz="4" w:space="0" w:color="000000"/>
+            </w:tcBorders>
+            <w:tcMar>
+              <w:top w:w="80" w:type="dxa"/>
+              <w:start w:w="100" w:type="dxa"/>
+              <w:bottom w:w="80" w:type="dxa"/>
+              <w:end w:w="100" w:type="dxa"/>
+            </w:tcMar>
+            <w:vAlign w:val="center"/>
+          </w:tcPr>
+          <w:p>
+            <w:r>
+              <w:rPr>
+                <w:rFonts w:ascii="Arial" w:hAnsi="Arial" w:eastAsia="Arial"/>
+                <w:color w:val="000000"/>
+                <w:sz w:val="22"/>
+              </w:rPr>
+              <w:t>11–12</w:t>
+            </w:r>
+          </w:p>
+        </w:tc>
+        <w:tc>
+          <w:tcPr>
+            <w:tcW w:type="dxa" w:w="2880"/>
+            <w:shd w:fill="FFFFFF"/>
+            <w:tcBorders>
+              <w:top w:val="single" w:sz="4" w:space="0" w:color="000000"/>
+              <w:left w:val="single" w:sz="4" w:space="0" w:color="000000"/>
+              <w:bottom w:val="single" w:sz="4" w:space="0" w:color="000000"/>
+              <w:right w:val="single" w:sz="4" w:space="0" w:color="000000"/>
+              <w:insideH w:val="single" w:sz="4" w:space="0" w:color="000000"/>
+              <w:insideV w:val="single" w:sz="4" w:space="0" w:color="000000"/>
+            </w:tcBorders>
+            <w:tcMar>
+              <w:top w:w="80" w:type="dxa"/>
+              <w:start w:w="100" w:type="dxa"/>
+              <w:bottom w:w="80" w:type="dxa"/>
+              <w:end w:w="100" w:type="dxa"/>
+            </w:tcMar>
+            <w:vAlign w:val="center"/>
+          </w:tcPr>
+          <w:p>
+            <w:r>
+              <w:rPr>
+                <w:rFonts w:ascii="Arial" w:hAnsi="Arial" w:eastAsia="Arial"/>
+                <w:color w:val="000000"/>
+                <w:sz w:val="22"/>
+              </w:rPr>
+              <w:t>Preparar manuales; revisar accesibilidad y responsive; completar matriz y anexos; ensayar sustentación.</w:t>
+            </w:r>
+          </w:p>
+        </w:tc>
+        <w:tc>
+          <w:tcPr>
+            <w:tcW w:type="dxa" w:w="2880"/>
+            <w:shd w:fill="FFFFFF"/>
+            <w:tcBorders>
+              <w:top w:val="single" w:sz="4" w:space="0" w:color="000000"/>
+              <w:left w:val="single" w:sz="4" w:space="0" w:color="000000"/>
+              <w:bottom w:val="single" w:sz="4" w:space="0" w:color="000000"/>
+              <w:right w:val="single" w:sz="4" w:space="0" w:color="000000"/>
+              <w:insideH w:val="single" w:sz="4" w:space="0" w:color="000000"/>
+              <w:insideV w:val="single" w:sz="4" w:space="0" w:color="000000"/>
+            </w:tcBorders>
+            <w:tcMar>
+              <w:top w:w="80" w:type="dxa"/>
+              <w:start w:w="100" w:type="dxa"/>
+              <w:bottom w:w="80" w:type="dxa"/>
+              <w:end w:w="100" w:type="dxa"/>
+            </w:tcMar>
+            <w:vAlign w:val="center"/>
+          </w:tcPr>
+          <w:p>
+            <w:r>
+              <w:rPr>
+                <w:rFonts w:ascii="Arial" w:hAnsi="Arial" w:eastAsia="Arial"/>
+                <w:color w:val="000000"/>
+                <w:sz w:val="22"/>
+              </w:rPr>
+              <w:t>Recursos y guion editables.</w:t>
+            </w:r>
+          </w:p>
+        </w:tc>
+      </w:tr>
+      <w:tr>
+        <w:trPr>
+          <w:cantSplit/>
+        </w:trPr>
+        <w:tc>
+          <w:tcPr>
+            <w:tcW w:type="dxa" w:w="2880"/>
+            <w:shd w:fill="FFFFFF"/>
+            <w:tcBorders>
+              <w:top w:val="single" w:sz="4" w:space="0" w:color="000000"/>
+              <w:left w:val="single" w:sz="4" w:space="0" w:color="000000"/>
+              <w:bottom w:val="single" w:sz="4" w:space="0" w:color="000000"/>
+              <w:right w:val="single" w:sz="4" w:space="0" w:color="000000"/>
+              <w:insideH w:val="single" w:sz="4" w:space="0" w:color="000000"/>
+              <w:insideV w:val="single" w:sz="4" w:space="0" w:color="000000"/>
+            </w:tcBorders>
+            <w:tcMar>
+              <w:top w:w="80" w:type="dxa"/>
+              <w:start w:w="100" w:type="dxa"/>
+              <w:bottom w:w="80" w:type="dxa"/>
+              <w:end w:w="100" w:type="dxa"/>
+            </w:tcMar>
+            <w:vAlign w:val="center"/>
+          </w:tcPr>
+          <w:p>
+            <w:r>
+              <w:rPr>
+                <w:rFonts w:ascii="Arial" w:hAnsi="Arial" w:eastAsia="Arial"/>
+                <w:color w:val="000000"/>
+                <w:sz w:val="22"/>
+              </w:rPr>
+              <w:t>13</w:t>
+            </w:r>
+          </w:p>
+        </w:tc>
+        <w:tc>
+          <w:tcPr>
+            <w:tcW w:type="dxa" w:w="2880"/>
+            <w:shd w:fill="FFFFFF"/>
+            <w:tcBorders>
+              <w:top w:val="single" w:sz="4" w:space="0" w:color="000000"/>
+              <w:left w:val="single" w:sz="4" w:space="0" w:color="000000"/>
+              <w:bottom w:val="single" w:sz="4" w:space="0" w:color="000000"/>
+              <w:right w:val="single" w:sz="4" w:space="0" w:color="000000"/>
+              <w:insideH w:val="single" w:sz="4" w:space="0" w:color="000000"/>
+              <w:insideV w:val="single" w:sz="4" w:space="0" w:color="000000"/>
+            </w:tcBorders>
+            <w:tcMar>
+              <w:top w:w="80" w:type="dxa"/>
+              <w:start w:w="100" w:type="dxa"/>
+              <w:bottom w:w="80" w:type="dxa"/>
+              <w:end w:w="100" w:type="dxa"/>
+            </w:tcMar>
+            <w:vAlign w:val="center"/>
+          </w:tcPr>
+          <w:p>
+            <w:r>
+              <w:rPr>
+                <w:rFonts w:ascii="Arial" w:hAnsi="Arial" w:eastAsia="Arial"/>
+                <w:color w:val="000000"/>
+                <w:sz w:val="22"/>
+              </w:rPr>
+              <w:t>Revisar el paquete completo; validar la entrega en aula virtual; realizar sustentación si corresponde.</w:t>
+            </w:r>
+          </w:p>
+        </w:tc>
+        <w:tc>
+          <w:tcPr>
+            <w:tcW w:type="dxa" w:w="2880"/>
+            <w:shd w:fill="FFFFFF"/>
+            <w:tcBorders>
+              <w:top w:val="single" w:sz="4" w:space="0" w:color="000000"/>
+              <w:left w:val="single" w:sz="4" w:space="0" w:color="000000"/>
+              <w:bottom w:val="single" w:sz="4" w:space="0" w:color="000000"/>
+              <w:right w:val="single" w:sz="4" w:space="0" w:color="000000"/>
+              <w:insideH w:val="single" w:sz="4" w:space="0" w:color="000000"/>
+              <w:insideV w:val="single" w:sz="4" w:space="0" w:color="000000"/>
+            </w:tcBorders>
+            <w:tcMar>
+              <w:top w:w="80" w:type="dxa"/>
+              <w:start w:w="100" w:type="dxa"/>
+              <w:bottom w:w="80" w:type="dxa"/>
+              <w:end w:w="100" w:type="dxa"/>
+            </w:tcMar>
+            <w:vAlign w:val="center"/>
+          </w:tcPr>
+          <w:p>
+            <w:r>
+              <w:rPr>
+                <w:rFonts w:ascii="Arial" w:hAnsi="Arial" w:eastAsia="Arial"/>
+                <w:color w:val="000000"/>
+                <w:sz w:val="22"/>
+              </w:rPr>
+              <w:t>Hito final según Anexo 4.</w:t>
             </w:r>
           </w:p>
         </w:tc>
@@ -2146,9 +1706,16 @@
     <w:p>
       <w:pPr>
         <w:pStyle w:val="Heading1"/>
+        <w:keepNext/>
+        <w:keepLines/>
       </w:pPr>
       <w:r>
-        <w:t>4. Lista de verificación antes de entregar</w:t>
+        <w:rPr>
+          <w:rFonts w:ascii="Arial" w:hAnsi="Arial" w:eastAsia="Arial"/>
+          <w:color w:val="000000"/>
+          <w:sz w:val="22"/>
+        </w:rPr>
+        <w:t>4. Control del trabajo</w:t>
       </w:r>
     </w:p>
     <w:p>
@@ -2156,7 +1723,12 @@
         <w:pStyle w:val="ListBullet"/>
       </w:pPr>
       <w:r>
-        <w:t>Completar nombres, integrantes, institución, ubicación, fechas y firmas.</w:t>
+        <w:rPr>
+          <w:rFonts w:ascii="Arial" w:hAnsi="Arial" w:eastAsia="Arial"/>
+          <w:color w:val="000000"/>
+          <w:sz w:val="22"/>
+        </w:rPr>
+        <w:t>Mantener historias y tareas en una lista priorizada con criterio de aceptación.</w:t>
       </w:r>
     </w:p>
     <w:p>
@@ -2164,7 +1736,12 @@
         <w:pStyle w:val="ListBullet"/>
       </w:pPr>
       <w:r>
-        <w:t>Revisar que el informe esté en Word editable y conserve tablas, imágenes y títulos.</w:t>
+        <w:rPr>
+          <w:rFonts w:ascii="Arial" w:hAnsi="Arial" w:eastAsia="Arial"/>
+          <w:color w:val="000000"/>
+          <w:sz w:val="22"/>
+        </w:rPr>
+        <w:t>Registrar bloqueos, cambios y acuerdos con fecha y responsable reales.</w:t>
       </w:r>
     </w:p>
     <w:p>
@@ -2172,7 +1749,12 @@
         <w:pStyle w:val="ListBullet"/>
       </w:pPr>
       <w:r>
-        <w:t>Adjuntar código fuente, SQL, diagramas, evidencias, manuales y matriz de pruebas.</w:t>
+        <w:rPr>
+          <w:rFonts w:ascii="Arial" w:hAnsi="Arial" w:eastAsia="Arial"/>
+          <w:color w:val="000000"/>
+          <w:sz w:val="22"/>
+        </w:rPr>
+        <w:t>Conservar salidas de compilación y pruebas en docs/evidencias/.</w:t>
       </w:r>
     </w:p>
     <w:p>
@@ -2180,28 +1762,37 @@
         <w:pStyle w:val="ListBullet"/>
       </w:pPr>
       <w:r>
-        <w:t>Comprobar que la defensa explique problema, objetivos, producto, resultados y mejoras.</w:t>
-      </w:r>
-    </w:p>
-    <w:p>
-      <w:pPr>
-        <w:pStyle w:val="ListBullet"/>
-      </w:pPr>
-      <w:r>
-        <w:t>Verificar el cronograma exacto publicado por la docente, debido a diferencias entre el Anexo 4 y el sílabo consultado.</w:t>
+        <w:rPr>
+          <w:rFonts w:ascii="Arial" w:hAnsi="Arial" w:eastAsia="Arial"/>
+          <w:color w:val="000000"/>
+          <w:sz w:val="22"/>
+        </w:rPr>
+        <w:t>Revisar los entregables con el docente-monitor antes de la fecha vigente del aula virtual.</w:t>
       </w:r>
     </w:p>
     <w:p>
       <w:pPr>
         <w:pStyle w:val="Heading1"/>
+        <w:keepNext/>
+        <w:keepLines/>
       </w:pPr>
       <w:r>
-        <w:t>5. Observación importante</w:t>
+        <w:rPr>
+          <w:rFonts w:ascii="Arial" w:hAnsi="Arial" w:eastAsia="Arial"/>
+          <w:color w:val="000000"/>
+          <w:sz w:val="22"/>
+        </w:rPr>
+        <w:t>5. Diferencias de calendario</w:t>
       </w:r>
     </w:p>
     <w:p>
       <w:r>
-        <w:t>Los documentos revisados presentan referencias de semanas distintas: el Anexo 4 Nivel 2 señala 50% en semana 10 y final en semana 13; el sílabo consultado señala evaluación final en semana 7. Para evitar una entrega fuera de plazo, prevalece la fecha específica del aula virtual y del anuncio vigente de la docente.</w:t>
+        <w:rPr>
+          <w:rFonts w:ascii="Arial" w:hAnsi="Arial" w:eastAsia="Arial"/>
+          <w:color w:val="000000"/>
+          <w:sz w:val="22"/>
+        </w:rPr>
+        <w:t>El anuncio del Entregable 1 muestra un plazo del 21 al 27 de septiembre de 2026. El Anexo 4 Nivel 2 indica avance en semana 10 y cierre en semana 13, mientras el sílabo 2026 ubica la evaluación final en semana 7. El plan conserva ambos hitos relativos para no descartar un requisito; el aula virtual y la docente deben confirmar la fecha que rige la entrega final.</w:t>
       </w:r>
     </w:p>
     <w:sectPr>
@@ -2225,13 +1816,18 @@
     </w:pPr>
     <w:r>
       <w:rPr>
-        <w:rFonts w:ascii="Arial" w:hAnsi="Arial"/>
-        <w:color w:val="6B7280"/>
-        <w:sz w:val="16"/>
-      </w:rPr>
-      <w:t xml:space="preserve">EFSR14908  ·  Documento editable  ·  Página </w:t>
+        <w:rFonts w:ascii="Arial" w:hAnsi="Arial" w:eastAsia="Arial"/>
+        <w:color w:val="000000"/>
+        <w:sz w:val="22"/>
+      </w:rPr>
+      <w:t xml:space="preserve">EFSR14908 | Página </w:t>
     </w:r>
     <w:r>
+      <w:rPr>
+        <w:rFonts w:ascii="Arial" w:hAnsi="Arial" w:eastAsia="Arial"/>
+        <w:color w:val="000000"/>
+        <w:sz w:val="22"/>
+      </w:rPr>
       <w:fldChar w:fldCharType="begin"/>
       <w:instrText xml:space="preserve"> PAGE </w:instrText>
       <w:fldChar w:fldCharType="end"/>
@@ -2249,11 +1845,11 @@
     </w:pPr>
     <w:r>
       <w:rPr>
-        <w:rFonts w:ascii="Arial" w:hAnsi="Arial"/>
-        <w:color w:val="6B7280"/>
-        <w:sz w:val="16"/>
-      </w:rPr>
-      <w:t>BODEGA NORTE  |  EFSR14908</w:t>
+        <w:rFonts w:ascii="Arial" w:hAnsi="Arial" w:eastAsia="Arial"/>
+        <w:color w:val="000000"/>
+        <w:sz w:val="22"/>
+      </w:rPr>
+      <w:t>BODEGA NORTE | EFSR14908</w:t>
     </w:r>
   </w:p>
 </w:hdr>
@@ -2623,11 +2219,13 @@
     <w:qFormat/>
     <w:rsid w:val="00FC693F"/>
     <w:pPr>
+      <w:keepLines/>
+      <w:widowControl/>
       <w:spacing w:after="120" w:line="240" w:lineRule="auto"/>
     </w:pPr>
     <w:rPr>
       <w:rFonts w:ascii="Arial" w:hAnsi="Arial" w:eastAsia="Arial"/>
-      <w:color w:val="222222"/>
+      <w:color w:val="000000"/>
       <w:sz w:val="22"/>
     </w:rPr>
   </w:style>
@@ -2686,15 +2284,15 @@
     <w:pPr>
       <w:keepNext/>
       <w:keepLines/>
-      <w:spacing w:before="200" w:after="100"/>
+      <w:spacing w:before="160" w:after="80" w:line="240" w:lineRule="auto"/>
       <w:outlineLvl w:val="0"/>
     </w:pPr>
     <w:rPr>
       <w:rFonts w:asciiTheme="majorHAnsi" w:eastAsiaTheme="majorEastAsia" w:hAnsiTheme="majorHAnsi" w:cstheme="majorBidi" w:ascii="Arial" w:hAnsi="Arial" w:eastAsia="Arial"/>
       <w:b/>
       <w:bCs/>
-      <w:color w:val="10294B"/>
-      <w:sz w:val="32"/>
+      <w:color w:val="000000"/>
+      <w:sz w:val="22"/>
       <w:szCs w:val="28"/>
     </w:rPr>
   </w:style>
@@ -2710,15 +2308,15 @@
     <w:pPr>
       <w:keepNext/>
       <w:keepLines/>
-      <w:spacing w:before="200" w:after="100"/>
+      <w:spacing w:before="160" w:after="80" w:line="240" w:lineRule="auto"/>
       <w:outlineLvl w:val="1"/>
     </w:pPr>
     <w:rPr>
       <w:rFonts w:asciiTheme="majorHAnsi" w:eastAsiaTheme="majorEastAsia" w:hAnsiTheme="majorHAnsi" w:cstheme="majorBidi" w:ascii="Arial" w:hAnsi="Arial" w:eastAsia="Arial"/>
       <w:b/>
       <w:bCs/>
-      <w:color w:val="1F4E79"/>
-      <w:sz w:val="26"/>
+      <w:color w:val="000000"/>
+      <w:sz w:val="22"/>
       <w:szCs w:val="26"/>
     </w:rPr>
   </w:style>
@@ -2734,14 +2332,14 @@
     <w:pPr>
       <w:keepNext/>
       <w:keepLines/>
-      <w:spacing w:before="200" w:after="100"/>
+      <w:spacing w:before="160" w:after="80" w:line="240" w:lineRule="auto"/>
       <w:outlineLvl w:val="2"/>
     </w:pPr>
     <w:rPr>
       <w:rFonts w:asciiTheme="majorHAnsi" w:eastAsiaTheme="majorEastAsia" w:hAnsiTheme="majorHAnsi" w:cstheme="majorBidi" w:ascii="Arial" w:hAnsi="Arial" w:eastAsia="Arial"/>
       <w:b/>
       <w:bCs/>
-      <w:color w:val="1F4E79"/>
+      <w:color w:val="000000"/>
       <w:sz w:val="22"/>
     </w:rPr>
   </w:style>
@@ -2973,19 +2571,16 @@
     <w:qFormat/>
     <w:rsid w:val="00FC693F"/>
     <w:pPr>
-      <w:pBdr>
-        <w:bottom w:val="single" w:sz="8" w:space="4" w:color="4F81BD" w:themeColor="accent1"/>
-      </w:pBdr>
-      <w:spacing w:after="100" w:line="240" w:lineRule="auto" w:before="200"/>
+      <w:spacing w:after="80" w:line="240" w:lineRule="auto" w:before="160"/>
       <w:contextualSpacing/>
     </w:pPr>
     <w:rPr>
       <w:rFonts w:asciiTheme="majorHAnsi" w:eastAsiaTheme="majorEastAsia" w:hAnsiTheme="majorHAnsi" w:cstheme="majorBidi" w:ascii="Arial" w:hAnsi="Arial" w:eastAsia="Arial"/>
       <w:b/>
-      <w:color w:val="10294B"/>
+      <w:color w:val="000000"/>
       <w:spacing w:val="5"/>
       <w:kern w:val="28"/>
-      <w:sz w:val="40"/>
+      <w:sz w:val="22"/>
       <w:szCs w:val="52"/>
     </w:rPr>
   </w:style>
@@ -3159,8 +2754,14 @@
       <w:numPr>
         <w:numId w:val="1"/>
       </w:numPr>
+      <w:spacing w:line="240" w:lineRule="auto"/>
       <w:contextualSpacing/>
     </w:pPr>
+    <w:rPr>
+      <w:rFonts w:ascii="Arial" w:hAnsi="Arial" w:eastAsia="Arial"/>
+      <w:color w:val="000000"/>
+      <w:sz w:val="22"/>
+    </w:rPr>
   </w:style>
   <w:style w:type="paragraph" w:styleId="ListBullet2">
     <w:name w:val="List Bullet 2"/>
@@ -3172,8 +2773,14 @@
       <w:numPr>
         <w:numId w:val="2"/>
       </w:numPr>
+      <w:spacing w:line="240" w:lineRule="auto"/>
       <w:contextualSpacing/>
     </w:pPr>
+    <w:rPr>
+      <w:rFonts w:ascii="Arial" w:hAnsi="Arial" w:eastAsia="Arial"/>
+      <w:color w:val="000000"/>
+      <w:sz w:val="22"/>
+    </w:rPr>
   </w:style>
   <w:style w:type="paragraph" w:styleId="ListBullet3">
     <w:name w:val="List Bullet 3"/>
@@ -3198,8 +2805,14 @@
       <w:numPr>
         <w:numId w:val="5"/>
       </w:numPr>
+      <w:spacing w:line="240" w:lineRule="auto"/>
       <w:contextualSpacing/>
     </w:pPr>
+    <w:rPr>
+      <w:rFonts w:ascii="Arial" w:hAnsi="Arial" w:eastAsia="Arial"/>
+      <w:color w:val="000000"/>
+      <w:sz w:val="22"/>
+    </w:rPr>
   </w:style>
   <w:style w:type="paragraph" w:styleId="ListNumber2">
     <w:name w:val="List Number 2"/>
@@ -3211,8 +2824,14 @@
       <w:numPr>
         <w:numId w:val="6"/>
       </w:numPr>
+      <w:spacing w:line="240" w:lineRule="auto"/>
       <w:contextualSpacing/>
     </w:pPr>
+    <w:rPr>
+      <w:rFonts w:ascii="Arial" w:hAnsi="Arial" w:eastAsia="Arial"/>
+      <w:color w:val="000000"/>
+      <w:sz w:val="22"/>
+    </w:rPr>
   </w:style>
   <w:style w:type="paragraph" w:styleId="ListNumber3">
     <w:name w:val="List Number 3"/>

</xml_diff>